<commit_message>
Auditoría de referencias: corrige 19 entradas de la bibliografía
Verificación de las 106 entradas de Notas y lecturas: todas las obras existen.
Se corrigen editoriales, años y traductores, y se sustituyen dos ediciones
castellanas no localizables (Floridi, Lyon) por las originales.

Co-Authored-By: Claude Opus 5.5 <noreply@anthropic.com>
Claude-Session: https://claude.ai/code/session_01Qu4vbrz7BffupnAMtng73g
</commit_message>
<xml_diff>
--- a/salida/el-alma-en-la-plataforma.docx
+++ b/salida/el-alma-en-la-plataforma.docx
@@ -7896,7 +7896,20 @@
         <w:t xml:space="preserve">A History of Women Philosophers</w:t>
       </w:r>
       <w:r>
-        <w:t xml:space="preserve">, vol. 1, Dordrecht, Springer, 1987.</w:t>
+        <w:t xml:space="preserve">, vol. 1:</w:t>
+      </w:r>
+      <w:r>
+        <w:t xml:space="preserve"> </w:t>
+      </w:r>
+      <w:r>
+        <w:rPr>
+          <w:iCs/>
+          <w:i/>
+        </w:rPr>
+        <w:t xml:space="preserve">Ancient Women Philosophers, 600 B.C.-500 A.D.</w:t>
+      </w:r>
+      <w:r>
+        <w:t xml:space="preserve">, Dordrecht, Martinus Nijhoff, 1987.</w:t>
       </w:r>
     </w:p>
     <w:p>
@@ -8082,7 +8095,20 @@
         <w:t xml:space="preserve">Obras de San Agustín</w:t>
       </w:r>
       <w:r>
-        <w:t xml:space="preserve">, vol. III, Madrid, BAC.</w:t>
+        <w:t xml:space="preserve">, t. III:</w:t>
+      </w:r>
+      <w:r>
+        <w:t xml:space="preserve"> </w:t>
+      </w:r>
+      <w:r>
+        <w:rPr>
+          <w:iCs/>
+          <w:i/>
+        </w:rPr>
+        <w:t xml:space="preserve">Obras filosóficas</w:t>
+      </w:r>
+      <w:r>
+        <w:t xml:space="preserve">, Madrid, BAC.</w:t>
       </w:r>
     </w:p>
     <w:p>
@@ -8132,7 +8158,7 @@
         <w:t xml:space="preserve">La ciudad de las damas</w:t>
       </w:r>
       <w:r>
-        <w:t xml:space="preserve">, Madrid, Siruela, 2015.</w:t>
+        <w:t xml:space="preserve">, ed. y trad. de Marie-José Lemarchand, Madrid, Siruela.</w:t>
       </w:r>
     </w:p>
     <w:p>
@@ -8217,7 +8243,7 @@
         <w:t xml:space="preserve">Ensayos</w:t>
       </w:r>
       <w:r>
-        <w:t xml:space="preserve">, libro I, Madrid, Cátedra, 1998.</w:t>
+        <w:t xml:space="preserve">, libro I, trad. de M.ª Dolores Picazo y Almudena Montojo, Madrid, Cátedra (Letras Universales).</w:t>
       </w:r>
     </w:p>
     <w:p>
@@ -8317,7 +8343,7 @@
         <w:t xml:space="preserve">Vindicación de los derechos de la mujer</w:t>
       </w:r>
       <w:r>
-        <w:t xml:space="preserve">, Madrid, Cátedra, 2018.</w:t>
+        <w:t xml:space="preserve">, ed. de Isabel Burdiel, Madrid, Cátedra, 2018.</w:t>
       </w:r>
     </w:p>
     <w:p>
@@ -8364,10 +8390,10 @@
           <w:iCs/>
           <w:i/>
         </w:rPr>
-        <w:t xml:space="preserve">Sobre pedagogía</w:t>
-      </w:r>
-      <w:r>
-        <w:t xml:space="preserve">, Madrid, Morata, 2003.</w:t>
+        <w:t xml:space="preserve">Pedagogía</w:t>
+      </w:r>
+      <w:r>
+        <w:t xml:space="preserve">, ed. de Mariano Fernández Enguita, Madrid, Akal, 1983.</w:t>
       </w:r>
     </w:p>
     <w:p>
@@ -8490,7 +8516,7 @@
         <w:t xml:space="preserve">Democracia y educación</w:t>
       </w:r>
       <w:r>
-        <w:t xml:space="preserve">, Madrid, Morata, 2009;</w:t>
+        <w:t xml:space="preserve">, trad. de Lorenzo Luzuriaga, Madrid, Morata, 1995;</w:t>
       </w:r>
       <w:r>
         <w:t xml:space="preserve"> </w:t>
@@ -8503,7 +8529,7 @@
         <w:t xml:space="preserve">Experiencia y educación</w:t>
       </w:r>
       <w:r>
-        <w:t xml:space="preserve">, Madrid, Morata, 2004.</w:t>
+        <w:t xml:space="preserve">, Madrid, Biblioteca Nueva.</w:t>
       </w:r>
     </w:p>
     <w:p>
@@ -8553,7 +8579,7 @@
         <w:t xml:space="preserve">En busca de la utopía. Un siglo de reformas de las escuelas públicas</w:t>
       </w:r>
       <w:r>
-        <w:t xml:space="preserve">, México, FCE / Morata.</w:t>
+        <w:t xml:space="preserve">, trad. de Mónica Utrilla, México, Fondo de Cultura Económica, 2001.</w:t>
       </w:r>
     </w:p>
     <w:p>
@@ -8603,7 +8629,7 @@
         <w:t xml:space="preserve">Education and Technology: Key Issues and Debates</w:t>
       </w:r>
       <w:r>
-        <w:t xml:space="preserve">, Londres, Bloomsbury.</w:t>
+        <w:t xml:space="preserve">, 3.ª ed., Londres, Bloomsbury, 2022.</w:t>
       </w:r>
     </w:p>
     <w:p>
@@ -8713,7 +8739,7 @@
         <w:t xml:space="preserve">¿Qué es un dispositivo?</w:t>
       </w:r>
       <w:r>
-        <w:t xml:space="preserve">, Buenos Aires, Adriana Hidalgo, 2014. Incluye la entrevista de Foucault de 1977 citada en el capítulo.</w:t>
+        <w:t xml:space="preserve">, Buenos Aires, Adriana Hidalgo, 2014 (también Barcelona, Anagrama, 2015). Incluye la entrevista de Foucault de 1977 citada en el capítulo.</w:t>
       </w:r>
     </w:p>
     <w:p>
@@ -9228,7 +9254,7 @@
         <w:t xml:space="preserve">European Journal of Education</w:t>
       </w:r>
       <w:r>
-        <w:t xml:space="preserve">, 2015.</w:t>
+        <w:t xml:space="preserve">, 50 (1), 2015, pp. 75-87.</w:t>
       </w:r>
     </w:p>
     <w:bookmarkEnd w:id="159"/>
@@ -9310,10 +9336,10 @@
           <w:iCs/>
           <w:i/>
         </w:rPr>
-        <w:t xml:space="preserve">Antrópica</w:t>
-      </w:r>
-      <w:r>
-        <w:t xml:space="preserve">, 1, 2015.</w:t>
+        <w:t xml:space="preserve">Antrópica. Revista de Ciencias Sociales y Humanidades</w:t>
+      </w:r>
+      <w:r>
+        <w:t xml:space="preserve">, 1 (1), 2015, pp. 126-135.</w:t>
       </w:r>
     </w:p>
     <w:p>
@@ -9398,10 +9424,10 @@
           <w:iCs/>
           <w:i/>
         </w:rPr>
-        <w:t xml:space="preserve">El cambio educativo en Finlandia</w:t>
-      </w:r>
-      <w:r>
-        <w:t xml:space="preserve">, Barcelona, Paidós.</w:t>
+        <w:t xml:space="preserve">El cambio educativo en Finlandia. ¿Qué puede aprender el mundo?</w:t>
+      </w:r>
+      <w:r>
+        <w:t xml:space="preserve">, Buenos Aires, Paidós, 2013.</w:t>
       </w:r>
     </w:p>
     <w:bookmarkEnd w:id="160"/>
@@ -9524,7 +9550,7 @@
         <w:t xml:space="preserve">Subjectivity</w:t>
       </w:r>
       <w:r>
-        <w:t xml:space="preserve">, 7, 2014.</w:t>
+        <w:t xml:space="preserve">, 7 (3), 2014, pp. 288-307.</w:t>
       </w:r>
     </w:p>
     <w:bookmarkEnd w:id="161"/>
@@ -9559,7 +9585,7 @@
         <w:t xml:space="preserve">El modo de existencia de los objetos técnicos</w:t>
       </w:r>
       <w:r>
-        <w:t xml:space="preserve">, Buenos Aires, Prometeo, 2008.</w:t>
+        <w:t xml:space="preserve">, trad. de Margarita Martínez y Pablo Rodríguez, Buenos Aires, Prometeo, 2007.</w:t>
       </w:r>
     </w:p>
     <w:p>
@@ -9622,7 +9648,7 @@
         <w:t xml:space="preserve">La técnica y el tiempo</w:t>
       </w:r>
       <w:r>
-        <w:t xml:space="preserve">, Hondarribia, Hiru;</w:t>
+        <w:t xml:space="preserve">, Hondarribia, Hiru, 2002;</w:t>
       </w:r>
       <w:r>
         <w:t xml:space="preserve"> </w:t>
@@ -9635,7 +9661,7 @@
         <w:t xml:space="preserve">Lo que hace que la vida merezca ser vivida. De la farmacología</w:t>
       </w:r>
       <w:r>
-        <w:t xml:space="preserve">, Madrid, Avarigani.</w:t>
+        <w:t xml:space="preserve">, trad. de Nadia Cortés, Avarigani, 2015.</w:t>
       </w:r>
     </w:p>
     <w:p>
@@ -9923,7 +9949,7 @@
         <w:pStyle w:val="Compact"/>
       </w:pPr>
       <w:r>
-        <w:t xml:space="preserve">Maurizio Lazzarato, «Trabajo inmaterial» y</w:t>
+        <w:t xml:space="preserve">Maurizio Lazzarato,</w:t>
       </w:r>
       <w:r>
         <w:t xml:space="preserve"> </w:t>
@@ -9936,7 +9962,20 @@
         <w:t xml:space="preserve">La fábrica del hombre endeudado</w:t>
       </w:r>
       <w:r>
-        <w:t xml:space="preserve">, Buenos Aires, Amorrortu.</w:t>
+        <w:t xml:space="preserve">, Buenos Aires, Amorrortu, 2013; con Antonio Negri,</w:t>
+      </w:r>
+      <w:r>
+        <w:t xml:space="preserve"> </w:t>
+      </w:r>
+      <w:r>
+        <w:rPr>
+          <w:iCs/>
+          <w:i/>
+        </w:rPr>
+        <w:t xml:space="preserve">Trabalho imaterial. Formas de vida e produção de subjetividade</w:t>
+      </w:r>
+      <w:r>
+        <w:t xml:space="preserve">, Río de Janeiro, DP&amp;A, 2001.</w:t>
       </w:r>
     </w:p>
     <w:p>
@@ -10008,10 +10047,10 @@
           <w:iCs/>
           <w:i/>
         </w:rPr>
-        <w:t xml:space="preserve">La cuarta revolución. Cómo la infosfera está transformando la realidad humana</w:t>
-      </w:r>
-      <w:r>
-        <w:t xml:space="preserve">.</w:t>
+        <w:t xml:space="preserve">The Fourth Revolution: How the Infosphere is Reshaping Human Reality</w:t>
+      </w:r>
+      <w:r>
+        <w:t xml:space="preserve">, Oxford, Oxford University Press, 2014.</w:t>
       </w:r>
     </w:p>
     <w:p>
@@ -10093,10 +10132,10 @@
           <w:iCs/>
           <w:i/>
         </w:rPr>
-        <w:t xml:space="preserve">La cultura de la vigilancia. Mirar y ser mirado en la sociedad contemporánea</w:t>
-      </w:r>
-      <w:r>
-        <w:t xml:space="preserve">.</w:t>
+        <w:t xml:space="preserve">The Culture of Surveillance: Watching as a Way of Life</w:t>
+      </w:r>
+      <w:r>
+        <w:t xml:space="preserve">, Cambridge, Polity, 2018.</w:t>
       </w:r>
     </w:p>
     <w:p>

</xml_diff>

<commit_message>
Depuración: menos andamiaje, entrevistas mejor delimitadas y absolutos
- Prólogo metodológico reducido a dos párrafos; escenas compuestas
  identificadas una sola vez; cautelas históricas integradas en la frase;
  fuera anuncios, recapitulaciones y explicaciones de APA para el lector.
- Entrevistas del cap. 5 como tres desplazamientos del registro, no como
  secuencia; riesgo frente a práctica en el cap. 4; perfiles de
  entrevistados menos identificables.
- Matiza los cinco absolutos señalados; distingue identidad cuantificada y
  empresario de sí en la escena de Clara; precisa el criterio de caducidad.
- Confirma en fuentes jurídicas el Reglamento (UE) 2026/1744 y la casación
  C-703/25 P.

Co-Authored-By: Claude Opus 5.5 <noreply@anthropic.com>
Claude-Session: https://claude.ai/code/session_01Qu4vbrz7BffupnAMtng73g
</commit_message>
<xml_diff>
--- a/salida/el-alma-en-la-plataforma.docx
+++ b/salida/el-alma-en-la-plataforma.docx
@@ -195,7 +195,7 @@
         <w:pStyle w:val="BodyText"/>
       </w:pPr>
       <w:r>
-        <w:t xml:space="preserve">Durante siglos, la escuela imprimió su sello en los alumnos, como se imprime una forma en la cera. Hoy les pide además otra cosa: que dejen huella. Que entreguen a tiempo, que se conecten, que completen, que respondan, que cada paso quede registrado. La escuela siempre pidió pruebas de lo aprendido, y no hay nada sospechoso en un cuaderno o en un examen. Lo que me ocupa es una inversión más reciente: el momento en que lo que puede registrarse empieza a decidir qué se reconoce como aprendizaje, y producir rastros se vuelve una obligación permanente. A esa inversión la llamaré</w:t>
+        <w:t xml:space="preserve">Durante siglos, la escuela imprimió su sello en los alumnos, como se imprime una forma en la cera. Hoy les pide además otra cosa: que dejen huella. Que entreguen a tiempo, que se conecten, que completen, que respondan, que cada paso quede registrado. La escuela siempre pidió pruebas de lo aprendido, y no hay nada sospechoso en un cuaderno o en un examen. Lo que me ocupa es una inversión más reciente: el momento en que lo que puede registrarse empieza a decidir qué se reconoce como aprendizaje, y producir rastros se vuelve una obligación permanente. A esa inversión la llamo</w:t>
       </w:r>
       <w:r>
         <w:t xml:space="preserve"> </w:t>
@@ -208,7 +208,7 @@
         <w:t xml:space="preserve">pedagogía de la huella</w:t>
       </w:r>
       <w:r>
-        <w:t xml:space="preserve">. En el capítulo 2 explico con precisión dónde empieza, y gran parte del libro intenta describir cómo funciona y qué hace con nosotros.</w:t>
+        <w:t xml:space="preserve">, y buena parte del libro intenta entender qué hace con nosotros.</w:t>
       </w:r>
     </w:p>
     <w:p>
@@ -286,7 +286,7 @@
         <w:pStyle w:val="BodyText"/>
       </w:pPr>
       <w:r>
-        <w:t xml:space="preserve">No he escrito un libro contra la tecnología, que sería tan ingenuo como inútil, ni un manual de buenas prácticas digitales. Es un ensayo de filosofía, y su ambición es formular mejor un problema que nos afecta a todos.</w:t>
+        <w:t xml:space="preserve">Es un ensayo de filosofía, y su ambición es formular mejor un problema que nos afecta a todos.</w:t>
       </w:r>
     </w:p>
     <w:p>
@@ -301,31 +301,15 @@
         <w:pStyle w:val="FirstParagraph"/>
       </w:pPr>
       <w:r>
-        <w:t xml:space="preserve">Conviene que el lector sepa en cada momento desde dónde le hablo, porque lo hago desde tres lugares distintos.</w:t>
-      </w:r>
-    </w:p>
-    <w:p>
-      <w:pPr>
-        <w:pStyle w:val="BodyText"/>
-      </w:pPr>
-      <w:r>
-        <w:t xml:space="preserve">A veces hablo como profesor que ha visto algo, y entonces lo digo así. Otras veces hablo como investigador que interpreta documentos: estudios, leyes, decisiones de autoridades públicas y también las entrevistas de mi propia investigación. Entre 2022 y 2023 participé en el proyecto edDIT, que estudió el uso de plataformas digitales corporativas en seis centros educativos de Cataluña, y en 2025 entrevisté a nueve docentes y especialistas de Cataluña y de Chile. Cuando cito sus palabras lo hago tal como quedaron registradas, sin nombres y con el perfil de cada persona. Y otras veces, por último, hablo como ensayista que construye una escena para pensar. La chica que abre la aplicación de su instituto en el primer capítulo o la madre que recibe un aviso a las nueve y veinte de la noche son composiciones de ese tipo: verosímiles, hechas con rasgos de aplicaciones que existen, pero no retratos de personas concretas. Cuando una escena es inventada, lo advierto.</w:t>
-      </w:r>
-    </w:p>
-    <w:p>
-      <w:pPr>
-        <w:pStyle w:val="BodyText"/>
-      </w:pPr>
-      <w:r>
-        <w:t xml:space="preserve">Hago una distinción parecida con la historia. Este libro junta épocas muy alejadas, y no siempre afirma que una cosa haya llevado a la otra. Unas veces señalo una transmisión histórica, con sus mediaciones; otras, una semejanza que sirve para pensar; otras, una lectura filosófica que propongo yo. Intento que el lector sepa cuál de las tres está leyendo.</w:t>
-      </w:r>
-    </w:p>
-    <w:p>
-      <w:pPr>
-        <w:pStyle w:val="BodyText"/>
-      </w:pPr>
-      <w:r>
-        <w:t xml:space="preserve">Explico cada concepto la primera vez que aparece, hay un glosario al final y las notas están al final del libro, para quien quiera comprobar las fuentes sin interrumpir la lectura.</w:t>
+        <w:t xml:space="preserve">Hablo desde varios lugares y procuro que se note cuándo cambio de uno a otro. A veces lo hago como profesor que ha visto algo. Otras, como investigador que interpreta estudios, leyes, decisiones públicas y el material de mi propia investigación: el proyecto edDIT, que entre 2022 y 2023 estudió el uso de plataformas corporativas en seis centros de Cataluña, y nueve entrevistas a docentes y especialistas de Cataluña y de Chile hechas en 2025, que cito sin nombres. Y otras, como ensayista que construye una escena para pensar, que presento entonces como tal.</w:t>
+      </w:r>
+    </w:p>
+    <w:p>
+      <w:pPr>
+        <w:pStyle w:val="BodyText"/>
+      </w:pPr>
+      <w:r>
+        <w:t xml:space="preserve">Con la historia hago algo parecido. Junto épocas lejanas para señalar unas veces una transmisión, otras una semejanza y otras una lectura propia, y procuro que se vea cuál es cada una. Las notas, al final del libro, permiten comprobar las fuentes sin interrumpir la lectura, y un glosario recoge los conceptos principales.</w:t>
       </w:r>
     </w:p>
     <w:p>
@@ -380,7 +364,7 @@
         <w:pStyle w:val="BodyText"/>
       </w:pPr>
       <w:r>
-        <w:t xml:space="preserve">Juntar un templo griego con una aplicación escolar puede parecer un truco retórico, y en parte lo es. No afirmo que una cosa venga de la otra, y las diferencias de escala, de técnica y de propósito son enormes. Lo que me interesa es una semejanza. En los dos casos alguien se encuentra con una imagen de lo que es, o de lo que debería ser, que le llega de fuera. Los griegos habrían dicho sin rodeos que en esos encuentros se forma un alma. Nosotros hemos perdido la costumbre de decirlo, y eso no quiere decir que haya dejado de ocurrir.</w:t>
+        <w:t xml:space="preserve">Juntar un templo griego con una aplicación escolar puede parecer un truco retórico, y en parte lo es. Las diferencias de escala, de técnica y de propósito son enormes. Lo que me interesa es una semejanza. En los dos casos alguien se encuentra con una imagen de lo que es, o de lo que debería ser, que le llega de fuera. Los griegos habrían dicho sin rodeos que en esos encuentros se forma un alma. Nosotros hemos perdido la costumbre de decirlo, y eso no quiere decir que haya dejado de ocurrir.</w:t>
       </w:r>
     </w:p>
     <w:p>
@@ -452,7 +436,7 @@
         <w:pStyle w:val="BodyText"/>
       </w:pPr>
       <w:r>
-        <w:t xml:space="preserve">Me interesa mucho lo que le ha pasado a esa imagen en nuestro tiempo, porque se ha dado la vuelta. La escuela sigue imprimiendo su sello, pero ahora exige también lo contrario: que sea el alumno quien deje huella en ella. Que se conecte, que entregue, que complete, que responda, y que cada uno de esos gestos quede grabado en algún sitio. La chica del gráfico de barras no solo recibe una forma: está obligada a producir rastros. Que la escuela pida pruebas de lo aprendido no tiene nada de nuevo, porque un cuaderno, una redacción o un examen también son huellas. Lo nuevo es que el rastro empiece a ocupar el lugar de lo que debía mostrar. Esa inversión, que delimitaré con cuidado en el capítulo siguiente, es para mí la novedad más importante de la escuela contemporánea.</w:t>
+        <w:t xml:space="preserve">Me interesa mucho lo que le ha pasado a esa imagen en nuestro tiempo, porque se ha dado la vuelta. La escuela sigue imprimiendo su sello, pero ahora exige también lo contrario: que sea el alumno quien deje huella en ella. Que se conecte, que entregue, que complete, que responda, y que cada uno de esos gestos quede grabado en algún sitio. La chica del gráfico de barras no solo recibe una forma: está obligada a producir rastros. Que la escuela pida pruebas de lo aprendido no tiene nada de nuevo, porque un cuaderno, una redacción o un examen también son huellas. Lo nuevo es que el rastro empiece a ocupar el lugar de lo que debía mostrar. Esa inversión es, para mí, la novedad más importante de la escuela contemporánea.</w:t>
       </w:r>
     </w:p>
     <w:p>
@@ -629,7 +613,7 @@
         <w:pStyle w:val="BodyText"/>
       </w:pPr>
       <w:r>
-        <w:t xml:space="preserve">Durkheim describía, sin escandalizarse, un taller que forma cuerpos y almas por encargo. La pregunta que me hago es quién hace hoy el encargo. En Atenas estaba claro que era la ciudad; en la Edad Media, la Iglesia; en el siglo XIX, el Estado. Pensemos ahora en una niña que pasa varias horas al día ante una plataforma diseñada en California, evaluada con criterios que se discuten en organismos internacionales, en un centro que compite con otros para atraer familias. Cuesta decir quién decide qué estados físicos, intelectuales y morales tiene que desarrollar. Esa dificultad para nombrar al que encarga es, creo, uno de los rasgos que mejor definen nuestra época, y el capítulo siguiente intenta explicarla.</w:t>
+        <w:t xml:space="preserve">Durkheim describía, sin escandalizarse, un taller que forma cuerpos y almas por encargo. La pregunta que me hago es quién hace hoy el encargo. En Atenas estaba claro que era la ciudad; en la Edad Media, la Iglesia; en el siglo XIX, el Estado. Pensemos ahora en una niña que pasa varias horas al día ante una plataforma diseñada en California, evaluada con criterios que se discuten en organismos internacionales, en un centro que compite con otros para atraer familias. Cuesta decir quién decide qué estados físicos, intelectuales y morales tiene que desarrollar. Esa dificultad para nombrar al que encarga es, creo, uno de los rasgos que mejor definen nuestra época.</w:t>
       </w:r>
     </w:p>
     <w:p>
@@ -905,7 +889,7 @@
         <w:pStyle w:val="BodyText"/>
       </w:pPr>
       <w:r>
-        <w:t xml:space="preserve">Volveré sobre esta idea, porque es clave para entender lo que hacen hoy las plataformas. Toda educación trabaja con el deseo. La diferencia entre una que libera y otra que somete está en hacia dónde lo dirige y en quién decide la dirección.</w:t>
+        <w:t xml:space="preserve">La idea es clave para entender lo que hacen hoy las plataformas. Toda educación trabaja con el deseo. La diferencia entre una que libera y otra que somete está en hacia dónde lo dirige y en quién decide la dirección.</w:t>
       </w:r>
     </w:p>
     <w:p>
@@ -1186,7 +1170,7 @@
         <w:pStyle w:val="BodyText"/>
       </w:pPr>
       <w:r>
-        <w:t xml:space="preserve">No hay una línea directa entre aquel trozo de madera y nuestros teléfonos, pero la semejanza me parece reveladora. La notificación cumple el papel de una Señal de otra época: el sonido, la vibración en la mesa, el punto rojo de una tarea pendiente, el aviso de que el plazo vence en dos horas. Tampoco explica nada y también funciona por reflejo, aunque con un alcance que los hermanos no podían soñar, porque ya no se queda en el aula ni en el horario escolar. Acompaña al alumno a casa, a su cuarto, a la cama.</w:t>
+        <w:t xml:space="preserve">La notificación se parece de un modo inquietante a aquella Señal: el sonido, la vibración en la mesa, el punto rojo de una tarea pendiente, el aviso de que el plazo vence en dos horas. Tampoco explica nada y también funciona por reflejo, aunque con un alcance que los hermanos no podían soñar, porque ya no se queda en el aula ni en el horario escolar. Acompaña al alumno a casa, a su cuarto, a la cama.</w:t>
       </w:r>
     </w:p>
     <w:p>
@@ -1201,7 +1185,7 @@
         <w:pStyle w:val="FirstParagraph"/>
       </w:pPr>
       <w:r>
-        <w:t xml:space="preserve">En el prólogo propuse una definición de plataforma educativa: una infraestructura digital que organiza o condiciona la comunicación, los contenidos, las tareas, la evaluación, el seguimiento y los datos de una escuela. Ahora puedo decir algo más. Una plataforma es la forma que adopta el dispositivo escolar cuando buena parte de sus hilos pasan por un mismo programa. Lo que antes estaba repartido entre la tarima, el boletín, la agenda, el tablón de anuncios y el despacho del tutor se reúne en una sola interfaz, con un mismo inicio de sesión. Y esa interfaz hace, con mayor o menor intensidad según el caso, cuatro cosas.</w:t>
+        <w:t xml:space="preserve">Ahora puedo precisar lo que en el prólogo llamé plataforma educativa. Es la forma que adopta el dispositivo escolar cuando buena parte de sus hilos pasan por un mismo programa. Lo que antes estaba repartido entre la tarima, el boletín, la agenda, el tablón de anuncios y el despacho del tutor se reúne en una sola interfaz, con un mismo inicio de sesión. Y esa interfaz hace, con mayor o menor intensidad según el caso, cuatro cosas.</w:t>
       </w:r>
     </w:p>
     <w:p>
@@ -1233,15 +1217,15 @@
         <w:pStyle w:val="BodyText"/>
       </w:pPr>
       <w:r>
-        <w:t xml:space="preserve">Y convierte la actividad en medida. Porcentajes de entrega, minutos de conexión, puntuaciones, insignias, medias del grupo. Lo que se mide se compara, y lo que se compara acaba ordenándose en una clasificación aunque nadie lo haya pedido.</w:t>
-      </w:r>
-    </w:p>
-    <w:p>
-      <w:pPr>
-        <w:pStyle w:val="BodyText"/>
-      </w:pPr>
-      <w:r>
-        <w:t xml:space="preserve">Tiempo, visibilidad, relación y medida no son inventos de la era digital. La escuela disciplinaria también ordenaba el tiempo con el timbre, hacía visibles a los alumnos con la disposición de los pupitres, organizaba las relaciones con la tarima y medía con el examen. Lo nuevo es que ahora las cuatro operaciones se hacen a la vez, de forma continua, en un mismo sitio y quedan registradas. Esa reunión crea las condiciones de lo que en el prólogo llamé pedagogía de la huella, y antes de seguir tengo que delimitar el concepto, porque se presta a una objeción evidente.</w:t>
+        <w:t xml:space="preserve">Y convierte la actividad en medida. Porcentajes de entrega, minutos de conexión, puntuaciones, insignias, medias del grupo. Lo que se mide invita a comparar, y en muchos usos la comparación termina en clasificación sin que nadie la haya pedido.</w:t>
+      </w:r>
+    </w:p>
+    <w:p>
+      <w:pPr>
+        <w:pStyle w:val="BodyText"/>
+      </w:pPr>
+      <w:r>
+        <w:t xml:space="preserve">Tiempo, visibilidad, relación y medida no son inventos de la era digital. La escuela disciplinaria también ordenaba el tiempo con el timbre, hacía visibles a los alumnos con la disposición de los pupitres, organizaba las relaciones con la tarima y medía con el examen. Lo nuevo es que ahora las cuatro operaciones se hacen a la vez, de forma continua, en un mismo sitio y quedan registradas. Esa reunión crea las condiciones de lo que llamo pedagogía de la huella, un concepto que necesita límites porque se presta a una objeción evidente.</w:t>
       </w:r>
     </w:p>
     <w:p>
@@ -1343,7 +1327,7 @@
         <w:pStyle w:val="BodyText"/>
       </w:pPr>
       <w:r>
-        <w:t xml:space="preserve">Hay que matizar en seguida, porque no todas las plataformas reciben ese préstamo en las mismas condiciones. Un Moodle alojado en los servidores de una consejería de educación, gestionado por técnicos públicos y sin otro negocio que el servicio educativo, también ordena el tiempo y produce medidas, pero no convierte los rastros de los alumnos en materia prima para otra cosa. Las cuatro operaciones son comunes. Lo que cambia de un caso a otro es quién se queda con la huella, para qué la usa y ante quién responde. Esa diferencia es política, y recorrerá todo el libro.</w:t>
+        <w:t xml:space="preserve">Hay que matizar en seguida, porque no todas las plataformas reciben ese préstamo en las mismas condiciones. Un Moodle alojado en los servidores de una consejería de educación, gestionado por técnicos públicos y sin otro negocio que el servicio educativo, también ordena el tiempo y produce medidas, pero no tiene ningún negocio en convertir los rastros de los alumnos en materia prima para otra cosa. Que no lo haga depende, de todos modos, de cómo se gobierne: de quién decide qué se guarda, para qué y con qué control. La titularidad pública es una condición favorable, no una garantía. Las cuatro operaciones son comunes. Lo que cambia de un caso a otro es quién se queda con la huella, para qué la usa y ante quién responde. Esa diferencia es política, y recorrerá todo el libro.</w:t>
       </w:r>
     </w:p>
     <w:p>
@@ -2242,7 +2226,7 @@
         <w:pStyle w:val="BodyText"/>
       </w:pPr>
       <w:r>
-        <w:t xml:space="preserve">Esa tercera dimensión no se deja reducir a las otras dos. Un alumno puede estar perfectamente calificado y perfectamente socializado sin haber respondido nunca de una manera que nadie esperaba, y eso es justo lo que ningún dispositivo puede fabricar a voluntad. Una plataforma puede medir la calificación y empujar la socialización. Puede incluso registrar el gesto con que alguien se sale del guion: una respuesta inesperada queda anotada como cualquier otra. Lo que no puede es comprender su significado educativo, porque ese significado depende de una historia, de una relación y de un juicio que no estaban previstos entre los datos. Para eso hace falta alguien que mire.</w:t>
+        <w:t xml:space="preserve">Esa tercera dimensión no se deja reducir a las otras dos. Un alumno puede estar perfectamente calificado y perfectamente socializado sin haber respondido nunca de una manera que nadie esperaba, y eso es justo lo que ningún dispositivo puede fabricar a voluntad. Una plataforma puede medir la calificación y empujar la socialización. Puede incluso registrar el gesto con que alguien se sale del guion: una respuesta inesperada queda anotada como cualquier otra. Lo que el registro no basta para captar es su significado educativo, que depende de una historia, de una relación y de un juicio que no estaban previstos entre los datos. Ningún registro sustituye el juicio de alguien que mire y responda de lo que ve.</w:t>
       </w:r>
     </w:p>
     <w:p>
@@ -2265,7 +2249,7 @@
         <w:pStyle w:val="BodyText"/>
       </w:pPr>
       <w:r>
-        <w:t xml:space="preserve">La comparación no sirve, por tanto, para echar de menos nada. Sirve para ver qué ha cambiado en la forma del poder. A la niña de Kant la obligaban a estar sentada. El alumno de hoy, en buena medida, se obliga solo. Lo empuja menos la mirada del maestro que su propio deseo de rendir, de mejorar, de no quedarse atrás. Si se me permite leer a La Boétie desde hoy, su servidumbre voluntaria encuentra aquí una forma especialmente acabada, una servidumbre que se vive como libertad, y para entenderla hay que seguir la historia de una idea que nació para liberar.</w:t>
+        <w:t xml:space="preserve">La comparación no sirve, por tanto, para echar de menos nada. Sirve para ver qué ha cambiado en la forma del poder. A la niña de Kant la obligaban a estar sentada. El alumno de hoy, en buena medida, se obliga solo. Lo empuja menos la mirada del maestro que su propio deseo de rendir, de mejorar, de no quedarse atrás. Leída desde hoy, la servidumbre voluntaria de La Boétie encuentra aquí una forma especialmente acabada, una servidumbre que se vive como libertad, y para entenderla hay que seguir la historia de una idea que nació para liberar.</w:t>
       </w:r>
     </w:p>
     <w:bookmarkEnd w:id="52"/>
@@ -2706,7 +2690,7 @@
         <w:pStyle w:val="BodyText"/>
       </w:pPr>
       <w:r>
-        <w:t xml:space="preserve">La escena que sigue es una composición, construida para pensar y no para documentar. No describe a ninguna alumna concreta, aunque cada uno de sus elementos existe en plataformas y centros reales.</w:t>
+        <w:t xml:space="preserve">La escena que sigue es una composición: no describe a ninguna alumna concreta, pero cada uno de sus elementos existe en plataformas y centros reales.</w:t>
       </w:r>
     </w:p>
     <w:p>
@@ -2747,6 +2731,14 @@
       </w:pPr>
       <w:r>
         <w:t xml:space="preserve">Un día, hablando con una amiga de qué carrera estudiar, dice: «Yo es que soy de seis». La frase ya no habla de una media. Habla de lo que ella cree ser, y el último eslabón se ha cerrado.</w:t>
+      </w:r>
+    </w:p>
+    <w:p>
+      <w:pPr>
+        <w:pStyle w:val="BodyText"/>
+      </w:pPr>
+      <w:r>
+        <w:t xml:space="preserve">En Clara aparecen juntas dos cosas que hay que distinguir. «Soy de seis» es una identidad cuantificada: alguien que se reconoce en una cifra, como tantos alumnos han hecho siempre con sus notas. El empresario de sí es otra figura. Aparece cuando el alumno empieza a administrar sus indicadores de forma continua, a anticipar riesgos y a elegir sus actividades según el rendimiento que espera de ellas, que es lo que hace Clara cuando revisa la aplicación cada noche, sube a última hora lo que tiene y escoge el tema más seguro. La primera puede darse sin la segunda. Lo que la plataforma favorece es que vayan juntas.</w:t>
       </w:r>
     </w:p>
     <w:p>
@@ -3013,7 +3005,7 @@
         <w:t xml:space="preserve"> </w:t>
       </w:r>
       <w:r>
-        <w:t xml:space="preserve">Una maestra de primaria que hoy enseña en la Universidad de Barcelona me explicó que en Moodle puede ver si sus alumnos han entrado o no, «pero creo que hay un riesgo en valorar la calidad académica del profesorado por aspectos numéricos irrelevantes, como la cantidad de feedback dado». Un profesor de filosofía de un instituto catalán lo dijo a propósito de la formación permanente: «Mucha gente hace formación solo para tener puntos… tengo certificaciones digitales que nunca me sirvieron en el aula». En los dos casos aparece la tercera operación del capítulo 2: un registro pensado para seguir un proceso que acaba sirviendo para valorar a la persona.</w:t>
+        <w:t xml:space="preserve">Una docente universitaria que antes fue maestra me explicó que en Moodle puede ver si sus alumnos han entrado o no, «pero creo que hay un riesgo en valorar la calidad académica del profesorado por aspectos numéricos irrelevantes, como la cantidad de feedback dado». Un profesor de secundaria catalán lo dijo a propósito de la formación permanente: «Mucha gente hace formación solo para tener puntos… tengo certificaciones digitales que nunca me sirvieron en el aula». La primera describe un riesgo: que la actividad registrada en la plataforma acabe sirviendo para juzgar a quien enseña. El segundo, una práctica que ya ocurre: formarse por los puntos que da la formación más que por lo que enseña. Entre el riesgo y la práctica se ve la pendiente hacia la tercera operación del capítulo 2.</w:t>
       </w:r>
     </w:p>
     <w:p>
@@ -3054,7 +3046,7 @@
         <w:pStyle w:val="FirstParagraph"/>
       </w:pPr>
       <w:r>
-        <w:t xml:space="preserve">Imaginemos que son las nueve y veinte de la noche y a una madre le vibra el teléfono. Es la aplicación del colegio: su hijo ha perdido dos puntos por «hablar en clase» y ha ganado uno por «participación». Hay un gráfico circular con los colores de la semana. Nadie le ha pedido a la madre que vigile a su hijo, y tampoco nadie le ha pedido al niño que se sepa vigilado. La información simplemente llega, a cualquier hora, con la naturalidad de un parte meteorológico. La escena es inventada, pero su mecanismo no lo es: aplicaciones como ClassDojo, muy extendidas en la primaria de muchos países, permiten que el docente sume o reste puntos de conducta y que la familia los consulte en su teléfono.</w:t>
+        <w:t xml:space="preserve">Imaginemos que son las nueve y veinte de la noche y a una madre le vibra el teléfono. Es la aplicación del colegio: su hijo ha perdido dos puntos por «hablar en clase» y ha ganado uno por «participación». Hay un gráfico circular con los colores de la semana. Nadie le ha pedido a la madre que vigile a su hijo, y tampoco nadie le ha pedido al niño que se sepa vigilado. La información simplemente llega, a cualquier hora, con la naturalidad de un parte meteorológico. Aplicaciones como ClassDojo, muy extendidas en la primaria de muchos países, permiten exactamente eso: el docente suma o resta puntos de conducta y la familia los consulta en su teléfono.</w:t>
       </w:r>
     </w:p>
     <w:p>
@@ -3263,7 +3255,7 @@
         <w:pStyle w:val="BodyText"/>
       </w:pPr>
       <w:r>
-        <w:t xml:space="preserve">Esa mirada no se queda en la pantalla del alumno. Llega a las instituciones, y ahí se ve con más claridad cómo un registro cambia de función. Las entrevistas que hice en 2025 para mi investigación dejan una secuencia que me parece reveladora, y la reconstruyo con las palabras de quienes la vivieron.</w:t>
+        <w:t xml:space="preserve">Esa mirada no se queda en la pantalla del alumno. Llega a las instituciones, y ahí se ve con más claridad cómo un registro cambia de función. Tres de las entrevistas que hice en 2025 no describen un mismo caso. Leídas juntas, permiten reconocer tres desplazamientos del registro.</w:t>
       </w:r>
       <w:bookmarkStart w:id="71" w:name="ref-05-6"/>
       <w:hyperlink w:anchor="nota-05-6">
@@ -3282,39 +3274,39 @@
         <w:pStyle w:val="BodyText"/>
       </w:pPr>
       <w:r>
-        <w:t xml:space="preserve">En Chile, el libro de clases en papel, donde cada profesor anota la asistencia, los contenidos tratados y las calificaciones, ha ido dejando paso a sistemas digitales. Un profesor de historia de un liceo público, con dieciséis años de oficio, lo resumió así: «El ministerio nos impone plataformas para reemplazar los libros de clases físicos, pero en realidad seguimos rindiendo cuentas del mismo modo, solo que ahora de forma digital». La decisión parecía técnica, un simple cambio de soporte. Lo que no cambió fue el sentido del registro.</w:t>
-      </w:r>
-    </w:p>
-    <w:p>
-      <w:pPr>
-        <w:pStyle w:val="BodyText"/>
-      </w:pPr>
-      <w:r>
-        <w:t xml:space="preserve">Un sociólogo que enseña en una universidad chilena me describió hasta dónde puede llegar ese sentido. «El cumplimiento se reduce a hacer clic», dijo. «Voy a la sala, inicio sesión, paso asistencia y me voy. Nadie verifica si efectivamente se hizo la clase.» Y comparaba dos tipos de universidad. En la pública, «subimos asistencia, notas, bitácoras… pero nadie lo revisa». En la privada, en cambio, «todo se mide y se reporta, lo que resulta agobiante».</w:t>
-      </w:r>
-    </w:p>
-    <w:p>
-      <w:pPr>
-        <w:pStyle w:val="BodyText"/>
-      </w:pPr>
-      <w:r>
-        <w:t xml:space="preserve">El desacuerdo que aparece aquí no enfrenta a dos personas. Enfrenta dos usos del mismo registro: para unos es un trámite vacío y para otros una vigilancia que asfixia. En ninguno de los dos casos sirve para conversar sobre lo que pasó en clase, que es lo único que justificaría tomarse la molestia de anotarlo.</w:t>
-      </w:r>
-    </w:p>
-    <w:p>
-      <w:pPr>
-        <w:pStyle w:val="BodyText"/>
-      </w:pPr>
-      <w:r>
-        <w:t xml:space="preserve">Una filósofa chilena especializada en ética aplicada señaló la consecuencia más seria, la que afecta a los alumnos: «transformar datos educativos extremadamente íntimos en etiquetas de riesgo personal cambia la perspectiva de la persona». Y añadió una comparación que no he podido olvidar. Muchas veces, dijo, se entiende que los datos de aprendizaje son «como tomarte la presión, pero no es así». La tensión arterial no cambia porque el paciente la mire. Un dato de aprendizaje convertido en etiqueta, en cambio, transforma cómo miran al alumno sus profesores y cómo se mira él.</w:t>
-      </w:r>
-    </w:p>
-    <w:p>
-      <w:pPr>
-        <w:pStyle w:val="BodyText"/>
-      </w:pPr>
-      <w:r>
-        <w:t xml:space="preserve">La secuencia tiene los tres elementos que me interesan. Hay una decisión institucional, digitalizar el registro. Hay un desacuerdo sobre su sentido, trámite o vigilancia. Y hay una consecuencia: el registro ocupa el lugar de lo que debía registrar, y la etiqueta, el de la persona. No hace falta suponer mala fe en nadie. Basta con que el registro esté siempre disponible y la conversación no.</w:t>
+        <w:t xml:space="preserve">En Chile, el libro de clases en papel, donde cada profesor anota la asistencia, los contenidos tratados y las calificaciones, ha ido dejando paso a sistemas digitales. Un profesor de un liceo público lo resumió así: «El ministerio nos impone plataformas para reemplazar los libros de clases físicos, pero en realidad seguimos rindiendo cuentas del mismo modo, solo que ahora de forma digital». El primer desplazamiento es ese: una decisión que parece técnica, un simple cambio de soporte, deja intacto el sentido del registro.</w:t>
+      </w:r>
+    </w:p>
+    <w:p>
+      <w:pPr>
+        <w:pStyle w:val="BodyText"/>
+      </w:pPr>
+      <w:r>
+        <w:t xml:space="preserve">El segundo aparece cuando el registro se separa de lo que debía registrar. Un profesor universitario chileno me lo describió así. «El cumplimiento se reduce a hacer clic», dijo. «Voy a la sala, inicio sesión, paso asistencia y me voy. Nadie verifica si efectivamente se hizo la clase.» Y comparaba dos tipos de universidad. En la pública, «subimos asistencia, notas, bitácoras… pero nadie lo revisa». En la privada, en cambio, «todo se mide y se reporta, lo que resulta agobiante».</w:t>
+      </w:r>
+    </w:p>
+    <w:p>
+      <w:pPr>
+        <w:pStyle w:val="BodyText"/>
+      </w:pPr>
+      <w:r>
+        <w:t xml:space="preserve">Lo que se enfrenta aquí son dos usos del mismo registro: en un sitio, un trámite vacío; en otro, una vigilancia que asfixia. En estos relatos, el registro aparece desvinculado de cualquier devolución pedagógica sobre lo ocurrido en clase.</w:t>
+      </w:r>
+    </w:p>
+    <w:p>
+      <w:pPr>
+        <w:pStyle w:val="BodyText"/>
+      </w:pPr>
+      <w:r>
+        <w:t xml:space="preserve">El tercer desplazamiento afecta a los alumnos, y una filósofa chilena lo formuló con precisión: «transformar datos educativos extremadamente íntimos en etiquetas de riesgo personal cambia la perspectiva de la persona». Y añadió una comparación que no he podido olvidar. Muchas veces, dijo, se entiende que los datos de aprendizaje son «como tomarte la presión, pero no es así». La tensión arterial no cambia porque el paciente la mire. Un dato de aprendizaje convertido en etiqueta, en cambio, transforma cómo miran al alumno sus profesores y cómo se mira él.</w:t>
+      </w:r>
+    </w:p>
+    <w:p>
+      <w:pPr>
+        <w:pStyle w:val="BodyText"/>
+      </w:pPr>
+      <w:r>
+        <w:t xml:space="preserve">Son tres desplazamientos distintos, que no tienen por qué darse juntos. Lo que comparten es que el registro se aleja de una conversación sobre lo aprendido. No hace falta suponer mala fe en nadie. Basta con que el registro esté siempre disponible y la conversación no.</w:t>
       </w:r>
     </w:p>
     <w:p>
@@ -3381,7 +3373,7 @@
         <w:pStyle w:val="BodyText"/>
       </w:pPr>
       <w:r>
-        <w:t xml:space="preserve">Hay que leer estos casos con cautela. Las cifras de Purdue no resistieron el examen, y las de Georgia State proceden de la propia universidad, que tiene buenas razones para contar bien sus éxitos. La única evaluación experimental independiente de un modelo parecido, un ensayo aleatorizado en once universidades estadounidenses que probó un asesoramiento proactivo apoyado en analítica, no encontró efectos promedio sobre la graduación ni la permanencia; solo los encontró, precisamente, en Georgia State.</w:t>
+        <w:t xml:space="preserve">Hay que leer estos casos con cautela. Las cifras de Purdue no resistieron el examen, y las de Georgia State proceden de la propia universidad, que tiene buenas razones para contar bien sus éxitos. Una evaluación experimental independiente de un modelo parecido, un ensayo aleatorizado en once universidades estadounidenses que probó un asesoramiento proactivo apoyado en analítica, no encontró efectos promedio sobre la graduación ni la permanencia; solo los encontró, precisamente, en Georgia State.</w:t>
       </w:r>
       <w:bookmarkStart w:id="74" w:name="ref-05-9"/>
       <w:hyperlink w:anchor="nota-05-9">
@@ -3549,7 +3541,7 @@
         <w:pStyle w:val="FirstParagraph"/>
       </w:pPr>
       <w:r>
-        <w:t xml:space="preserve">La tecnología educativa presenta todo esto con una palabra seductora, personalización. Cada alumno recibiría una enseñanza ajustada a su ritmo, a sus intereses y a sus necesidades. La promesa recoge ideas pedagógicas valiosas, y por eso resulta tan atractiva. Conviene distinguir aquí dos cosas que llevan el mismo nombre. Un buen maestro siempre ha personalizado: mira a cada alumno, ajusta una explicación, propone otra lectura. Esa atención no necesita ningún registro continuo. La personalización algorítmica es otra cosa. Para ajustar automáticamente la enseñanza a cada perfil, el sistema necesita seguir sin pausa la actividad de cada alumno, y en ese modelo personalizar y vigilar son dos caras de la misma operación.</w:t>
+        <w:t xml:space="preserve">La tecnología educativa presenta todo esto con una palabra seductora, personalización. Cada alumno recibiría una enseñanza ajustada a su ritmo, a sus intereses y a sus necesidades. La promesa recoge ideas pedagógicas valiosas, y por eso resulta tan atractiva. Conviene distinguir aquí dos cosas que llevan el mismo nombre. Un buen maestro siempre ha personalizado: mira a cada alumno, ajusta una explicación, propone otra lectura. Esa atención no necesita ningún registro continuo. La personalización algorítmica es otra cosa. En los modelos que ajustan automáticamente la enseñanza a partir de un seguimiento intensivo de la actividad de cada alumno, personalizar y vigilar son dos caras de la misma operación.</w:t>
       </w:r>
     </w:p>
     <w:p>
@@ -3670,7 +3662,7 @@
         <w:pStyle w:val="FirstParagraph"/>
       </w:pPr>
       <w:r>
-        <w:t xml:space="preserve">Entre el maestro interior de Agustín y la notificación de las nueve y veinte hay una continuidad que no borra sus diferencias: la de un poder que quiere conocer el alma para gobernarla. No la presento como una línea recta, porque en medio hay siglos de transformaciones, sino como una manera de leer el presente. El confesor escuchaba, el examen registraba y la plataforma calcula. Con cada cambio, la mirada se ha vuelto más precisa y más difícil de esquivar.</w:t>
+        <w:t xml:space="preserve">Entre el maestro interior de Agustín y la notificación de las nueve y veinte hay una continuidad que no borra siglos de diferencias: la de un poder que quiere conocer el alma para gobernarla. El confesor escuchaba, el examen registraba y la plataforma calcula. Con cada cambio, la mirada se ha vuelto más precisa y más difícil de esquivar.</w:t>
       </w:r>
     </w:p>
     <w:p>
@@ -3869,7 +3861,7 @@
         <w:pStyle w:val="BodyText"/>
       </w:pPr>
       <w:r>
-        <w:t xml:space="preserve">Es una aspiración generosa, nacida del deseo de que nadie se quedara sin educación, y contiene también el germen de algo más inquietante: la escuela como máquina y el alumno como materia que el método transforma de manera previsible. No digo que las plataformas desciendan de Comenio, pero se parecen mucho a su sueño. Secuencian contenidos, cronometran, comprueban resultados y ajustan el paso siguiente con una precisión que Comenio solo podía imaginar. Lo que él no previó es que el reloj podía tener dueño.</w:t>
+        <w:t xml:space="preserve">Es una aspiración generosa, nacida del deseo de que nadie se quedara sin educación, y contiene también el germen de algo más inquietante: la escuela como máquina y el alumno como materia que el método transforma de manera previsible. Su sueño encuentra una semejanza inesperada en las plataformas. Secuencian contenidos, cronometran, comprueban resultados y ajustan el paso siguiente con una precisión que Comenio solo podía imaginar. Lo que él no previó es que el reloj podía tener dueño.</w:t>
       </w:r>
     </w:p>
     <w:p>
@@ -4681,7 +4673,7 @@
         <w:t xml:space="preserve"> </w:t>
       </w:r>
       <w:r>
-        <w:t xml:space="preserve">La empresa no gana dinero vendiendo anuncios a los alumnos en Classroom. Lo que obtiene es otra cosa, y el caso danés del capítulo 5 ayuda a verlo: el uso de las huellas para mantener y mejorar sus productos y, sobre todo, el hábito. Millones de niños aprenden a trabajar y comunicarse dentro de un ecosistema concreto, y cuando terminen la escuela seguirán en él porque les parecerá lo natural. La escuela presta su autoridad y su público, como dije al principio, y la empresa cobra en costumbre.</w:t>
+        <w:t xml:space="preserve">La empresa no gana dinero vendiendo anuncios a los alumnos en Classroom. Lo que obtiene es otra cosa, y el caso danés del capítulo 5 ayuda a verlo: el uso de las huellas para mantener y mejorar sus productos y, sobre todo, el hábito. Millones de niños aprenden a trabajar y comunicarse dentro de un ecosistema concreto, y cuando terminen la escuela seguirán en él porque les parecerá lo natural. La escuela presta su autoridad y su público, y la empresa cobra en costumbre.</w:t>
       </w:r>
     </w:p>
     <w:p>
@@ -4737,15 +4729,15 @@
         <w:pStyle w:val="BodyText"/>
       </w:pPr>
       <w:r>
-        <w:t xml:space="preserve">El desacuerdo atravesaba a todos los actores. Una activista de Xnet sostenía que la administración catalana había promovido activamente la entrada de Google en el sistema educativo mediante un convenio que no pasó por un concurso público. Un representante de Microsoft defendía que «las herramientas sólo tienen sentido si sirven para cumplir los objetivos pedagógicos que establecen los docentes» y que el alumnado tiene que familiarizarse con el mundo en el que vive. Ninguna de las dos posiciones era absurda, y las dos tenían intereses.</w:t>
-      </w:r>
-    </w:p>
-    <w:p>
-      <w:pPr>
-        <w:pStyle w:val="BodyText"/>
-      </w:pPr>
-      <w:r>
-        <w:t xml:space="preserve">La consecuencia más clara la encontré después, en las entrevistas de 2025, y no tenía que ver con ninguna gran decisión. Una investigadora de la Universidad de Barcelona, muy crítica con las plataformas corporativas, me dijo: «Yo, siendo consciente de que Google extrae mis datos y los de mis estudiantes, sigo utilizando sus herramientas, básicamente por la comodidad». Una socióloga de la misma universidad fue más lejos: «Hace siete años dejé de utilizar en mi ordenador de trabajo software libre porque no podía trabajar con nadie». Y añadió la frase que mejor resume el problema: «tú no vas a usar una cosa que solo usas tú para comunicarte, porque entonces ¿con quién te vas a comunicar?».</w:t>
+        <w:t xml:space="preserve">El desacuerdo atravesaba a todos los actores. Una activista por los derechos digitales sostenía que la administración catalana había promovido activamente la entrada de Google en el sistema educativo mediante un convenio que no pasó por un concurso público. Un representante de una de las grandes tecnológicas defendía que «las herramientas sólo tienen sentido si sirven para cumplir los objetivos pedagógicos que establecen los docentes» y que el alumnado tiene que familiarizarse con el mundo en el que vive. Ninguna de las dos posiciones era absurda, y las dos tenían intereses.</w:t>
+      </w:r>
+    </w:p>
+    <w:p>
+      <w:pPr>
+        <w:pStyle w:val="BodyText"/>
+      </w:pPr>
+      <w:r>
+        <w:t xml:space="preserve">La consecuencia más clara la encontré después, en las entrevistas de 2025, y no tenía que ver con ninguna gran decisión. Una investigadora universitaria muy crítica con las plataformas corporativas me dijo: «Yo, siendo consciente de que Google extrae mis datos y los de mis estudiantes, sigo utilizando sus herramientas, básicamente por la comodidad». Otra investigadora fue más lejos: «Hace siete años dejé de utilizar en mi ordenador de trabajo software libre porque no podía trabajar con nadie». Y añadió la frase que mejor resume el problema: «tú no vas a usar una cosa que solo usas tú para comunicarte, porque entonces ¿con quién te vas a comunicar?».</w:t>
       </w:r>
     </w:p>
     <w:p>
@@ -4829,7 +4821,7 @@
         <w:pStyle w:val="BodyText"/>
       </w:pPr>
       <w:r>
-        <w:t xml:space="preserve">Un programa libre no forma a nadie por sí solo, y los docentes necesitan tiempo para aprender herramientas nuevas que a menudo son menos pulidas que las comerciales. Requiere mantenimiento: servidores, actualizaciones, copias de seguridad y técnicos que respondan cuando algo falla un lunes a las ocho. Plantea problemas de interoperabilidad, porque las familias, las universidades y otras administraciones usan otros formatos y otras plataformas, y ya vimos que una socióloga muy convencida acabó abandonándolo porque no podía trabajar con nadie. Tiene sus propios riesgos de seguridad, y un servidor público mal mantenido puede proteger peor los datos que una gran empresa con equipos dedicados. Puede agravar la desigualdad institucional, porque una administración rica puede sostener su propia infraestructura y un pequeño municipio rural no, y el resultado podría ser un sistema de dos velocidades, con soberanía para unos y dependencia para otros. Y muchos proyectos dependen de subvenciones y de personas entusiastas, de modo que cuando se acaba el dinero o se cansa la gente, se apagan.</w:t>
+        <w:t xml:space="preserve">Un programa libre no forma a nadie por sí solo, y los docentes necesitan tiempo para aprender herramientas nuevas que a menudo son menos pulidas que las comerciales. Requiere mantenimiento: servidores, actualizaciones, copias de seguridad y técnicos que respondan cuando algo falla un lunes a las ocho. Plantea problemas de interoperabilidad, porque las familias, las universidades y otras administraciones usan otros formatos y otras plataformas, y ya vimos que una investigadora convencida acabó abandonándolo porque no podía trabajar con nadie. Tiene sus propios riesgos de seguridad, y un servidor público mal mantenido puede proteger peor los datos que una gran empresa con equipos dedicados. Puede agravar la desigualdad institucional, porque una administración rica puede sostener su propia infraestructura y un pequeño municipio rural no, y el resultado podría ser un sistema de dos velocidades, con soberanía para unos y dependencia para otros. Y muchos proyectos dependen de subvenciones y de personas entusiastas, de modo que cuando se acaba el dinero o se cansa la gente, se apagan.</w:t>
       </w:r>
     </w:p>
     <w:p>
@@ -5102,7 +5094,7 @@
         <w:pStyle w:val="BodyText"/>
       </w:pPr>
       <w:r>
-        <w:t xml:space="preserve">Pienso en la chica del primer capítulo, la que abre la aplicación del instituto y encuentra un gráfico de barras antes que la tarea. A ella nadie le ha liberado el tiempo. Se lo han llenado. Si este libro ha seguido varios hilos (el sello, la red, el cuerpo, el empresario de sí mismo, la mirada, la memoria, el precio), todos acaban en el mismo nudo: de las cuatro operaciones de la plataforma, la que más ha transformado la escuela es la que ordena el tiempo. Por ahí empieza, creo, cualquier resistencia que valga la pena.</w:t>
+        <w:t xml:space="preserve">Pienso en la chica del primer capítulo, la que abre la aplicación del instituto y encuentra un gráfico de barras antes que la tarea. A ella nadie le ha liberado el tiempo. Se lo han llenado. De las cuatro operaciones de la plataforma, la que más ha transformado la escuela es, creo, la que ordena el tiempo. Por ahí empieza, creo, cualquier resistencia que valga la pena.</w:t>
       </w:r>
     </w:p>
     <w:p>
@@ -5624,7 +5616,7 @@
         <w:pStyle w:val="BodyText"/>
       </w:pPr>
       <w:r>
-        <w:t xml:space="preserve">Antes de concretarla, tengo que recordar los tres límites que este libro ha ido encontrando, porque marcan lo que la edutropía no puede ser. No puede ser nostalgia de una escuela anterior a las pantallas, que también pegaba, clasificaba y excluía. No puede despreciar a las comunidades que eligen herramientas digitales por razones de accesibilidad, de continuidad, de colaboración o de pura falta de recursos, porque esas razones son buenas y son, a menudo, las de quienes menos tienen. Y no puede confiar en que el software libre resuelva por sí solo lo que exige formación, mantenimiento, seguridad e inversión pública sostenida. Una crítica que ignore estos límites se vuelve un lujo de quien ya tiene asegurado lo demás.</w:t>
+        <w:t xml:space="preserve">Esa orientación hereda los límites que el libro ha ido encontrando: no puede ser nostalgia de la escuela anterior a las pantallas, ni desdén hacia quienes eligen la técnica por buenas razones, ni confianza en que el software libre resuelva solo lo que exige inversión pública.</w:t>
       </w:r>
     </w:p>
     <w:p>
@@ -5639,7 +5631,7 @@
         <w:pStyle w:val="FirstParagraph"/>
       </w:pPr>
       <w:r>
-        <w:t xml:space="preserve">Se me dirá que todo esto es vago, que una palabra nueva no arregla nada y que hablar de giros y de luz es una manera elegante de no proponer nada concreto. Acepto el riesgo, y por eso quiero bajar a tierra el giro en cuatro direcciones, las mismas cuatro cosas que, a mi juicio, se le han ido quitando a la escuela.</w:t>
+        <w:t xml:space="preserve">Una palabra nueva no arregla nada si no baja a tierra. Propongo cuatro direcciones, que son las cuatro cosas que, a mi juicio, se le han ido quitando a la escuela.</w:t>
       </w:r>
     </w:p>
     <w:p>
@@ -5767,7 +5759,7 @@
         <w:pStyle w:val="BodyText"/>
       </w:pPr>
       <w:r>
-        <w:t xml:space="preserve">Un conflicto parecido aparece entre la privacidad y el cuidado. Si la escuela deja de registrar las ausencias en la plataforma para no acumular datos, puede perder la señal que le habría permitido llamar a tiempo a una familia. Para estos casos propongo un criterio que se deriva de las tres operaciones del capítulo 2: toda huella que la escuela recoja debería tener un lector, un propósito y una fecha de caducidad. Un lector, es decir, alguien concreto que la mira para hacer algo por ese alumno. Un propósito que se pueda explicar al alumno y a su familia. Y una fecha a partir de la cual el registro desaparece en lugar de acumularse en un perfil. Un registro que nadie lee no protege a nadie, y uno que no caduca acaba convirtiéndose en juicio.</w:t>
+        <w:t xml:space="preserve">Un conflicto parecido aparece entre la privacidad y el cuidado. Si la escuela deja de registrar las ausencias en la plataforma para no acumular datos, puede perder la señal que le habría permitido llamar a tiempo a una familia. Para estos casos propongo un criterio que se deriva de las tres operaciones del capítulo 2: cada huella que la escuela recoja debería tener un lector, un propósito y una fecha de caducidad. Un lector, es decir, alguien concreto que la mira para hacer algo por ese alumno. Un propósito que se pueda explicar al alumno y a su familia. Y una fecha a partir de la cual el registro desaparece en lugar de acumularse en un perfil. Un registro que nadie lee no protege a nadie, y uno que no caduca acaba convirtiéndose en juicio. La fórmula no obliga a borrar sin más: un expediente académico o un registro que la ley manda conservar tienen sus propias razones y sus propios plazos. La conservación de cada registro debe justificarse por su finalidad, por las obligaciones que lo rigen y por el tiempo durante el que sigue siendo necesario. Lo que se rechaza es acumular por defecto.</w:t>
       </w:r>
     </w:p>
     <w:p>
@@ -5798,7 +5790,7 @@
         <w:pStyle w:val="FirstParagraph"/>
       </w:pPr>
       <w:r>
-        <w:t xml:space="preserve">Nada de esto supone desconectar la escuela. Vivimos en un mundo irreversiblemente atravesado por la técnica, y la educación no puede quedar fuera de él. Lo que sí puede hacer es negarse a recibir la tecnología como un destino, interrogarla en cada caso y discutir quién la controla y para qué.</w:t>
+        <w:t xml:space="preserve">Nada de esto supone desconectar la escuela, sino negarse a recibir la técnica como un destino, interrogarla en cada caso y discutir quién la controla y para qué.</w:t>
       </w:r>
     </w:p>
     <w:p>
@@ -5871,7 +5863,7 @@
         <w:pStyle w:val="FirstParagraph"/>
       </w:pPr>
       <w:r>
-        <w:t xml:space="preserve">He sostenido a lo largo de estas páginas que la escuela no ha sido sustituida por las plataformas, y que se ha convertido en uno de los lugares donde las plataformas aprenden a formar personas. Les presta un público que no puede marcharse, una autoridad que convierte cada hábito en virtud y diez o doce años de práctica diaria. A cambio recibe herramientas que de verdad ayudan, y una manera de entender la educación que casi nadie ha elegido.</w:t>
+        <w:t xml:space="preserve">La escuela que presta a las plataformas su público, su autoridad y su tiempo recibe a cambio herramientas que de verdad ayudan, y también una manera de entender la educación que casi nadie ha elegido.</w:t>
       </w:r>
     </w:p>
     <w:p>
@@ -5902,7 +5894,7 @@
         <w:pStyle w:val="FirstParagraph"/>
       </w:pPr>
       <w:r>
-        <w:t xml:space="preserve">A lo largo del libro he repetido que la educación tiene doble filo, y lo sostengo al final. Puede darnos herramientas para construirnos con cierta conciencia y puede, al mismo tiempo, moldearnos para fines que no son los nuestros. Ninguna época se libró de esa ambigüedad. La</w:t>
+        <w:t xml:space="preserve">La educación tiene doble filo. Puede darnos herramientas para construirnos con cierta conciencia y puede, al mismo tiempo, moldearnos para fines que no son los nuestros. Ninguna época se libró de esa ambigüedad. La</w:t>
       </w:r>
       <w:r>
         <w:t xml:space="preserve"> </w:t>
@@ -6858,7 +6850,7 @@
       </w:hyperlink>
       <w:bookmarkEnd w:id="176"/>
       <w:r>
-        <w:t xml:space="preserve">. Entrevistas semiestructuradas realizadas por el autor en febrero de 2025, para su investigación doctoral, a cinco especialistas y cuatro docentes de secundaria de Cataluña y Chile. Las personas entrevistadas dieron su consentimiento informado y se citan por su perfil, sin nombres. Como establece APA 7 para los participantes de una investigación propia, no figuran en la lista de referencias.</w:t>
+        <w:t xml:space="preserve">. Entrevistas semiestructuradas realizadas por el autor en febrero de 2025, para su investigación doctoral, a cinco especialistas y cuatro docentes de secundaria de Cataluña y Chile. Las personas entrevistadas dieron su consentimiento informado y se citan sin nombres.</w:t>
       </w:r>
     </w:p>
     <w:bookmarkEnd w:id="177"/>
@@ -6976,7 +6968,7 @@
       </w:hyperlink>
       <w:bookmarkEnd w:id="183"/>
       <w:r>
-        <w:t xml:space="preserve">. Entrevistas realizadas por el autor en febrero de 2025 (véanse las notas del capítulo 4). Hablan un profesor de historia de un liceo público chileno, un sociólogo de una universidad chilena y una filósofa de una universidad chilena.</w:t>
+        <w:t xml:space="preserve">. Entrevistas realizadas por el autor en febrero de 2025 (véanse las notas del capítulo 4). Hablan un profesor de un liceo público chileno y dos docentes universitarios chilenos.</w:t>
       </w:r>
     </w:p>
     <w:p>
@@ -8421,7 +8413,7 @@
         <w:pStyle w:val="FirstParagraph"/>
       </w:pPr>
       <w:r>
-        <w:t xml:space="preserve">Las notas citan con el sistema autor-año de APA 7, con el año de la edición original y el de la edición utilizada cuando no coinciden. Las obras clásicas griegas y latinas indican además la numeración canónica (Stephanus para Platón, Bekker para Aristóteles), que permite encontrar el pasaje en cualquier edición. Las citas de las entrevistas de mi investigación no figuran en la lista, como establece APA 7 para los participantes de una investigación propia.</w:t>
+        <w:t xml:space="preserve">Las notas citan cada obra por autor y año; cuando hay traducción, el primer año es el de la edición original. Las obras clásicas indican además la numeración canónica (Stephanus para Platón, Bekker para Aristóteles), que permite encontrar el pasaje en cualquier edición.</w:t>
       </w:r>
     </w:p>
     <w:bookmarkStart w:id="246" w:name="lecturas-comentadas"/>
@@ -11913,7 +11905,20 @@
         <w:t xml:space="preserve"> </w:t>
       </w:r>
       <w:r>
-        <w:t xml:space="preserve">(C-703/25 P). https://curia.europa.eu/juris/liste.jsf?num=C-703/25</w:t>
+        <w:t xml:space="preserve">(C-703/25 P).</w:t>
+      </w:r>
+      <w:r>
+        <w:t xml:space="preserve"> </w:t>
+      </w:r>
+      <w:r>
+        <w:rPr>
+          <w:iCs/>
+          <w:i/>
+        </w:rPr>
+        <w:t xml:space="preserve">Diario Oficial de la Unión Europea</w:t>
+      </w:r>
+      <w:r>
+        <w:t xml:space="preserve">, C, 2025/6610. https://eur-lex.europa.eu/eli/C/2025/6610/oj</w:t>
       </w:r>
     </w:p>
     <w:p>

</xml_diff>

<commit_message>
Ajustes finales: alma, Clara, gamificación y cierre
- Párrafo en el prólogo sobre el uso de la palabra «alma» y entrada en el
  glosario; cambia la imagen de la tiza.
- El móvil, como vía de acceso a las plataformas y no como plataforma.
- Precisa qué significa que las plataformas «aprenden a formar personas».
- Clara: el cero automático ya incorpora una interpretación.
- Gamificación delimitada y formulada como riesgo.
- Rebaja las conclusiones sobre el estudio del CIAE y la analítica.
- Epílogo: perfil frente a conocimiento de sí sin oponer dispositivo y
  educación; el derecho a hacer algo que no tenga que dejar registro.
- Estilo: menos universales sobre «los griegos» y «los romanos»; ajustes
  puntuales; leyes chilenas enlazadas a su documento; art. 113 en la nota
  del Reglamento de IA.

Co-Authored-By: Claude Opus 5.5 <noreply@anthropic.com>
Claude-Session: https://claude.ai/code/session_01Qu4vbrz7BffupnAMtng73g
</commit_message>
<xml_diff>
--- a/salida/el-alma-en-la-plataforma.docx
+++ b/salida/el-alma-en-la-plataforma.docx
@@ -156,7 +156,7 @@
         <w:pStyle w:val="FirstParagraph"/>
       </w:pPr>
       <w:r>
-        <w:t xml:space="preserve">Este libro no nació de una certeza. Nació de unas cuantas preguntas que se me fueron quedando pegadas durante años de clases, como el polvo de tiza que se acumula en el borde de la pizarra. ¿Qué significa enseñar? ¿Es la educación buena por definición o lo damos por hecho porque no sabemos imaginar otra cosa? ¿Qué le pasa a la voluntad de alguien cuando la institución que debía enseñarle a pensar se convierte en una cadena de producción? ¿Y qué le pasa cuando esa cadena ya no es de hierro sino de datos, y cabe en el bolsillo?</w:t>
+        <w:t xml:space="preserve">Este libro no nació de una certeza. Nació de unas cuantas preguntas que se me fueron quedando pegadas durante años de clases, como se le quedan a uno las preguntas de alumnos que no supo contestar. ¿Qué significa enseñar? ¿Es la educación buena por definición o lo damos por hecho porque no sabemos imaginar otra cosa? ¿Qué le pasa a la voluntad de alguien cuando la institución que debía enseñarle a pensar se convierte en una cadena de producción? ¿Y qué le pasa cuando esa cadena ya no es de hierro sino de datos, y cabe en el bolsillo?</w:t>
       </w:r>
     </w:p>
     <w:p>
@@ -195,6 +195,14 @@
         <w:pStyle w:val="BodyText"/>
       </w:pPr>
       <w:r>
+        <w:t xml:space="preserve">Uso una palabra deliberadamente antigua, alma, sin suponer una sustancia separada del cuerpo. Me interesa porque durante siglos nombró aquello que la educación aspiraba a formar: una manera de percibir, de desear, de juzgar y de relacionarse con otros. Hoy hablamos de competencias y de perfiles, pero esa formación no ha desaparecido. Ha cambiado de instrumentos, y este libro trata de algunos de ellos.</w:t>
+      </w:r>
+    </w:p>
+    <w:p>
+      <w:pPr>
+        <w:pStyle w:val="BodyText"/>
+      </w:pPr>
+      <w:r>
         <w:t xml:space="preserve">Durante siglos, la escuela imprimió su sello en los alumnos, como se imprime una forma en la cera. Hoy les pide además otra cosa: que dejen huella. Que entreguen a tiempo, que se conecten, que completen, que respondan, que cada paso quede registrado. La escuela siempre pidió pruebas de lo aprendido, y no hay nada sospechoso en un cuaderno o en un examen. Lo que me ocupa es una inversión más reciente: el momento en que lo que puede registrarse empieza a decidir qué se reconoce como aprendizaje, y producir rastros se vuelve una obligación permanente. A esa inversión la llamo</w:t>
       </w:r>
       <w:r>
@@ -223,7 +231,7 @@
         <w:pStyle w:val="FirstParagraph"/>
       </w:pPr>
       <w:r>
-        <w:t xml:space="preserve">Conviene precisar desde el principio qué entiendo por plataforma, porque la palabra sirve para casi todo. Llamo plataforma educativa a una infraestructura digital que organiza o condiciona lo que ocurre en la escuela: la comunicación, el acceso a los contenidos, la gestión de las tareas, la evaluación, el seguimiento de los alumnos, los datos que se recogen sobre ellos y las recomendaciones que se les hacen. Bajo ese nombre caben cosas distintas. Están los entornos de aprendizaje que usa cada centro, como Moodle, Google Classroom o Microsoft Teams; los paquetes de cuentas y herramientas que se contratan para toda una administración, como Google Workspace for Education o Microsoft 365; las aplicaciones de gestión de aula y de comunicación con las familias; los sistemas de detección de plagio y los paneles de seguimiento. Y están, rodeando todo esto, las plataformas comerciales que entran en la escuela sin que nadie las haya contratado: el teléfono móvil, las redes sociales y, desde hace poco, la inteligencia artificial generativa.</w:t>
+        <w:t xml:space="preserve">Conviene precisar desde el principio qué entiendo por plataforma, porque la palabra sirve para casi todo. Llamo plataforma educativa a una infraestructura digital que organiza o condiciona lo que ocurre en la escuela: la comunicación, el acceso a los contenidos, la gestión de las tareas, la evaluación, el seguimiento de los alumnos, los datos que se recogen sobre ellos y las recomendaciones que se les hacen. Bajo ese nombre caben cosas distintas. Están los entornos de aprendizaje que usa cada centro, como Moodle, Google Classroom o Microsoft Teams; los paquetes de cuentas y herramientas que se contratan para toda una administración, como Google Workspace for Education o Microsoft 365; las aplicaciones de gestión de aula y de comunicación con las familias; los sistemas de detección de plagio y los paneles de seguimiento. Y están, rodeando todo esto, las plataformas comerciales que entran en la escuela sin que nadie las haya contratado, casi siempre a través del teléfono móvil: las redes sociales y, desde hace poco, la inteligencia artificial generativa.</w:t>
       </w:r>
     </w:p>
     <w:p>
@@ -364,7 +372,7 @@
         <w:pStyle w:val="BodyText"/>
       </w:pPr>
       <w:r>
-        <w:t xml:space="preserve">Juntar un templo griego con una aplicación escolar puede parecer un truco retórico, y en parte lo es. Las diferencias de escala, de técnica y de propósito son enormes. Lo que me interesa es una semejanza. En los dos casos alguien se encuentra con una imagen de lo que es, o de lo que debería ser, que le llega de fuera. Los griegos habrían dicho sin rodeos que en esos encuentros se forma un alma. Nosotros hemos perdido la costumbre de decirlo, y eso no quiere decir que haya dejado de ocurrir.</w:t>
+        <w:t xml:space="preserve">Juntar un templo griego con una aplicación escolar puede parecer un truco retórico, y en parte lo es. Las diferencias de escala, de técnica y de propósito son enormes. Lo que me interesa es una semejanza. En los dos casos alguien se encuentra con una imagen de lo que es, o de lo que debería ser, que le llega de fuera. Platón o Aristóteles habrían dicho sin rodeos que en esos encuentros se forma un alma. Nosotros hemos perdido la costumbre de decirlo, y eso no quiere decir que haya dejado de ocurrir.</w:t>
       </w:r>
     </w:p>
     <w:p>
@@ -547,7 +555,7 @@
         <w:t xml:space="preserve"> </w:t>
       </w:r>
       <w:r>
-        <w:t xml:space="preserve">de un cuchillo es cortar bien y la de un caballo, correr. La de una persona era vivir de acuerdo con lo que la hace humana, y para los griegos eso significaba vivir según la razón y en compañía de otros. Aristóteles añadía que nadie nace con ella: uno se hace justo haciendo cosas justas, igual que se hace citarista tocando la cítara.</w:t>
+        <w:t xml:space="preserve">de un cuchillo es cortar bien y la de un caballo, correr. La de una persona era vivir de acuerdo con lo que la hace humana, y para Aristóteles eso significaba vivir según la razón y en compañía de otros. Aristóteles añadía que nadie nace con ella: uno se hace justo haciendo cosas justas, igual que se hace citarista tocando la cítara.</w:t>
       </w:r>
       <w:bookmarkStart w:id="23" w:name="ref-01-3"/>
       <w:hyperlink w:anchor="nota-01-3">
@@ -579,7 +587,7 @@
         <w:t xml:space="preserve">areté</w:t>
       </w:r>
       <w:r>
-        <w:t xml:space="preserve">. Ocupan su sitio palabras como competencias, empleabilidad o éxito. Algo, sin embargo, ha resistido: la escuela sigue sirviendo a un proyecto de sociedad y sigue decidiendo qué tipo de persona merece la pena formar. Lo que ha cambiado es el lugar donde lo dice. Las leyes siguen declarando fines generosos, como el pleno desarrollo de la personalidad o la formación de ciudadanos críticos, pero lo que orienta la vida diaria de muchas escuelas aparece en otra parte, en los indicadores y en las clasificaciones, con el aspecto de una cuestión técnica. Los griegos sabían que estaban formando almas. Nosotros creemos a menudo que solo desarrollamos competencias, y esa distancia entre lo que declaramos y lo que hacemos me inquieta más que cualquier ideal confesado, por discutible que fuera.</w:t>
+        <w:t xml:space="preserve">. Ocupan su sitio palabras como competencias, empleabilidad o éxito. Algo, sin embargo, ha resistido: la escuela sigue sirviendo a un proyecto de sociedad y sigue decidiendo qué tipo de persona merece la pena formar. Lo que ha cambiado es el lugar donde lo dice. Las leyes siguen declarando fines generosos, como el pleno desarrollo de la personalidad o la formación de ciudadanos críticos, pero lo que orienta la vida diaria de muchas escuelas aparece en otra parte, en los indicadores y en las clasificaciones, con el aspecto de una cuestión técnica. Platón y Aristóteles sabían que estaban formando almas. Nosotros creemos a menudo que solo desarrollamos competencias, y esa distancia entre lo que declaramos y lo que hacemos me inquieta más que cualquier ideal confesado, por discutible que fuera.</w:t>
       </w:r>
     </w:p>
     <w:p>
@@ -964,7 +972,23 @@
         <w:pStyle w:val="BodyText"/>
       </w:pPr>
       <w:r>
-        <w:t xml:space="preserve">Los griegos sabían quién sostenía el sello. Nosotros tenemos ministerios, agencias de evaluación, empresas tecnológicas, familias y docentes que empujan más o menos en la misma dirección sin que nadie parezca haberlo decidido. Un taller así, sin dueño a la vista, exige otra herramienta para pensarlo.</w:t>
+        <w:t xml:space="preserve">Quienes pensaron la</w:t>
+      </w:r>
+      <w:r>
+        <w:t xml:space="preserve"> </w:t>
+      </w:r>
+      <w:r>
+        <w:rPr>
+          <w:iCs/>
+          <w:i/>
+        </w:rPr>
+        <w:t xml:space="preserve">paideia</w:t>
+      </w:r>
+      <w:r>
+        <w:t xml:space="preserve"> </w:t>
+      </w:r>
+      <w:r>
+        <w:t xml:space="preserve">sabían quién sostenía el sello. Nosotros tenemos ministerios, agencias de evaluación, empresas tecnológicas, familias y docentes que empujan más o menos en la misma dirección sin que nadie parezca haberlo decidido. Un taller así, sin dueño a la vista, exige otra herramienta para pensarlo.</w:t>
       </w:r>
     </w:p>
     <w:bookmarkEnd w:id="29"/>
@@ -1319,7 +1343,7 @@
         <w:pStyle w:val="BodyText"/>
       </w:pPr>
       <w:r>
-        <w:t xml:space="preserve">Este préstamo es lo que me hace decir que la escuela se ha convertido en uno de los lugares donde las plataformas aprenden a formar personas. Ahí ensayan su manera de ordenar el tiempo, la visibilidad, las relaciones y la medida sobre un público cautivo y bajo la protección de una institución que casi todos consideran benéfica.</w:t>
+        <w:t xml:space="preserve">Este préstamo es lo que me hace decir que la escuela se ha convertido en uno de los lugares donde las plataformas aprenden a formar personas. No hablo solo del aprendizaje automático, que muchas de estas herramientas ni siquiera usan. Hablo también de empresas e instituciones que perfeccionan sus maneras de organizar la actividad a medida que ven, curso tras curso, cómo se usan sus servicios en millones de aulas. Ahí ensayan su manera de ordenar el tiempo, la visibilidad, las relaciones y la medida sobre un público cautivo y bajo la protección de una institución que casi todos consideran benéfica.</w:t>
       </w:r>
     </w:p>
     <w:p>
@@ -1578,7 +1602,7 @@
         <w:pStyle w:val="BodyText"/>
       </w:pPr>
       <w:r>
-        <w:t xml:space="preserve">Con esta corrección, la idea de Agamben me parece muy útil. La escuela funciona en buena medida como una</w:t>
+        <w:t xml:space="preserve">Así entendida, la idea de Agamben resulta muy útil. La escuela funciona en buena medida como una</w:t>
       </w:r>
       <w:r>
         <w:t xml:space="preserve"> </w:t>
@@ -2540,7 +2564,7 @@
         <w:pStyle w:val="FirstParagraph"/>
       </w:pPr>
       <w:r>
-        <w:t xml:space="preserve">En 1784 Kant respondió a la pregunta «¿Qué es la Ilustración?» con una definición que todavía se copia en las pizarras. La Ilustración es la salida del ser humano de su minoría de edad, de la que él mismo es culpable, y ser menor de edad es no poder servirse del propio entendimiento sin la guía de otro.</w:t>
+        <w:t xml:space="preserve">En 1784 Kant respondió a la pregunta «¿Qué es la Ilustración?» con una definición que todavía se repite en las aulas. La Ilustración es la salida del ser humano de su minoría de edad, de la que él mismo es culpable, y ser menor de edad es no poder servirse del propio entendimiento sin la guía de otro.</w:t>
       </w:r>
       <w:r>
         <w:t xml:space="preserve"> </w:t>
@@ -2698,15 +2722,15 @@
         <w:pStyle w:val="BodyText"/>
       </w:pPr>
       <w:r>
-        <w:t xml:space="preserve">Clara está en primero de bachillerato. Un martes por la noche abre la aplicación del instituto y ve que su media de matemáticas ha bajado de 6,8 a 6,1. No ha hecho un examen peor: una tarea que no subió a tiempo figura con un cero automático. Hasta aquí, solo hay un registro.</w:t>
-      </w:r>
-    </w:p>
-    <w:p>
-      <w:pPr>
-        <w:pStyle w:val="BodyText"/>
-      </w:pPr>
-      <w:r>
-        <w:t xml:space="preserve">El miércoles, el panel de la tutora la pinta en ámbar. El color no lo ha elegido la tutora. Lo produce una regla configurada a principio de curso, que marca a quien baja de cierta media y acumula dos entregas tardías, y que convierte un retraso en una señal de riesgo. Es el segundo eslabón, y casi nadie lo percibe como una interpretación, porque llega con apariencia de dato.</w:t>
+        <w:t xml:space="preserve">Clara está en primero de bachillerato. Un martes por la noche abre la aplicación del instituto y ve que su media de matemáticas ha bajado de 6,8 a 6,1. No ha hecho un examen peor: una tarea que no subió a tiempo figura con un cero automático. Hasta aquí, el registro ya incorpora una primera interpretación: no entregar equivale a obtener un cero. Algunas decisiones llegan incorporadas al registro, y por eso cuesta reconocerlas como decisiones.</w:t>
+      </w:r>
+    </w:p>
+    <w:p>
+      <w:pPr>
+        <w:pStyle w:val="BodyText"/>
+      </w:pPr>
+      <w:r>
+        <w:t xml:space="preserve">El miércoles, el panel de la tutora la pinta en ámbar. El color no lo ha elegido la tutora. Lo produce una regla configurada a principio de curso, que marca a quien baja de cierta media y acumula dos entregas tardías, y que convierte un retraso en una señal de riesgo. Es el segundo eslabón, la interpretación institucional propiamente dicha, y también llega con apariencia de dato.</w:t>
       </w:r>
     </w:p>
     <w:p>
@@ -3390,7 +3414,7 @@
         <w:t xml:space="preserve"> </w:t>
       </w:r>
       <w:r>
-        <w:t xml:space="preserve">Nada de esto demuestra que la analítica funcione. Permiten, eso sí, formular una hipótesis que el debate suele pasar por alto: lo decisivo puede no ser el indicador, sino lo que ocurre después de que se enciende la luz roja. Cuando la alerta abre una conversación con una persona que tiene tiempo, la analítica puede servir a la justicia. Cuando se convierte en una etiqueta, un correo automático o una derivación sin diálogo, corre el riesgo de fabricar aquello que predice: el estudiante marcado como probable abandono es tratado como tal, y empieza a comportarse en consecuencia. El riesgo, además, se calcula con datos del pasado, y los datos del pasado traen consigo las desigualdades del pasado.</w:t>
+        <w:t xml:space="preserve">Estos resultados no permiten atribuir a la analítica, por sí sola, una mejora general de la graduación o la permanencia. Permiten, eso sí, formular una hipótesis que el debate suele pasar por alto: lo decisivo puede no ser el indicador, sino lo que ocurre después de que se enciende la luz roja. Cuando la alerta abre una conversación con una persona que tiene tiempo, la analítica puede servir a la justicia. Cuando se convierte en una etiqueta, un correo automático o una derivación sin diálogo, corre el riesgo de fabricar aquello que predice: el estudiante marcado como probable abandono es tratado como tal, y empieza a comportarse en consecuencia. El riesgo, además, se calcula con datos del pasado, y los datos del pasado traen consigo las desigualdades del pasado.</w:t>
       </w:r>
     </w:p>
     <w:p>
@@ -4255,7 +4279,7 @@
         <w:pStyle w:val="BodyText"/>
       </w:pPr>
       <w:r>
-        <w:t xml:space="preserve">Thamus temía alumnos con aire de sabios. Lo de hoy es más raro: textos que parecen pensados sin que nadie los haya pensado. Prohibir no basta, igual que no sirvió abolir la escritura para responder a Theuth. Platón escribió, aunque eligió el diálogo, la forma que más se parece a una conversación viva y que obliga a pensar con los personajes en vez de recibir una doctrina hecha. Tal vez la escuela tenga que hacer algo parecido con las máquinas que escriben: devolver valor a lo que ocurre en presencia, a la conversación, al borrador comentado, a la defensa oral de lo escrito, y usar la máquina para discutir con ella más que para ahorrarse el pensamiento.</w:t>
+        <w:t xml:space="preserve">Thamus temía alumnos con aire de sabios. Lo de hoy es más raro: textos que parecen pensados sin que nadie los haya pensado. Prohibir no basta, igual que la respuesta a Theuth no consiste en abolir la escritura. Platón escribió, aunque eligió el diálogo, la forma que más se parece a una conversación viva y que obliga a pensar con los personajes en vez de recibir una doctrina hecha. Tal vez la escuela tenga que hacer algo parecido con las máquinas que escriben: devolver valor a lo que ocurre en presencia, a la conversación, al borrador comentado, a la defensa oral de lo escrito, y usar la máquina para discutir con ella más que para ahorrarse el pensamiento.</w:t>
       </w:r>
     </w:p>
     <w:p>
@@ -4304,7 +4328,7 @@
         <w:pStyle w:val="BodyText"/>
       </w:pPr>
       <w:r>
-        <w:t xml:space="preserve">La cultura griega llegó a Roma en buena parte como botín. Las familias patricias compraban esclavos griegos para que educaran a sus hijos, y durante mucho tiempo enseñar fue un oficio de poca categoría. Los romanos vivían con una paradoja que todavía reconocemos: aprender daba honra y enseñar casi daba vergüenza. Cicerón distinguía las artes propias de un hombre libre, las</w:t>
+        <w:t xml:space="preserve">La cultura griega llegó a Roma en buena parte como botín. Las familias patricias compraban esclavos griegos para que educaran a sus hijos, y durante mucho tiempo enseñar fue un oficio de poca categoría. Roma vivió con una paradoja que todavía reconocemos: aprender daba honra y enseñar casi daba vergüenza. Cicerón distinguía las artes propias de un hombre libre, las</w:t>
       </w:r>
       <w:r>
         <w:t xml:space="preserve"> </w:t>
@@ -4508,7 +4532,7 @@
         <w:pStyle w:val="BodyText"/>
       </w:pPr>
       <w:r>
-        <w:t xml:space="preserve">Los resultados son reales y parciales. Un estudio del Centro de Investigación Avanzada en Educación de la Universidad de Chile, presentado en julio de 2026 con datos de 2,7 millones de estudiantes, estima que la segregación escolar se redujo cerca de un 10 % desde 2015 hasta sus niveles más bajos en veinte años, y asocia esa reducción sobre todo a dos políticas: la subvención preferente para alumnos vulnerables, vigente desde 2008, y la Ley de Inclusión Escolar. Es una asociación estadística sólida, no una prueba concluyente. El efecto del sistema de admisión sigue en discusión, el Gobierno impulsa en 2026 una reforma de ese mismo sistema, y nadie discute que la segregación sigue siendo alta.</w:t>
+        <w:t xml:space="preserve">Los resultados son reales y parciales. Un estudio del Centro de Investigación Avanzada en Educación de la Universidad de Chile, presentado en julio de 2026 con datos de 2,7 millones de estudiantes, estima que la segregación escolar se redujo cerca de un 10 % desde 2015 hasta sus niveles más bajos en veinte años, y asocia esa reducción sobre todo a dos políticas: la subvención preferente para alumnos vulnerables, vigente desde 2008, y la Ley de Inclusión Escolar. La presentación pública del estudio informa de una asociación estadística, no de una prueba causal concluyente. El efecto del sistema de admisión sigue en discusión, el Gobierno impulsa en 2026 una reforma de ese mismo sistema, y nadie discute que la segregación sigue siendo alta.</w:t>
       </w:r>
       <w:bookmarkStart w:id="104" w:name="ref-07-7"/>
       <w:hyperlink w:anchor="nota-07-7">
@@ -4909,7 +4933,7 @@
         <w:pStyle w:val="FirstParagraph"/>
       </w:pPr>
       <w:r>
-        <w:t xml:space="preserve">Queda una forma de mercantilización que se disfraza de lo contrario de un mercado, el juego. La gamificación lleva a la escuela puntos, niveles, insignias, clasificaciones y premios. Se presenta como una manera de motivar, y abundan las aplicaciones que dan y quitan puntos por la conducta o que convierten las preguntas de clase en concursos con clasificación. Funcionan, en el sentido de que los alumnos participan más.</w:t>
+        <w:t xml:space="preserve">Queda una forma de mercantilización que se disfraza de lo contrario de un mercado, el juego. La gamificación lleva a la escuela puntos, niveles, insignias, clasificaciones y premios, y se presenta como una manera de motivar. No me refiero a cualquier práctica que use elementos de juego, que muchos maestros han usado siempre con sentido, sino a una gamificación que organiza la actividad mediante recompensas externas, clasificaciones y presión por completar: aplicaciones que dan y quitan puntos por la conducta o que convierten las preguntas de clase en concursos con ranking.</w:t>
       </w:r>
     </w:p>
     <w:p>
@@ -4934,7 +4958,7 @@
         <w:t xml:space="preserve"> </w:t>
       </w:r>
       <w:r>
-        <w:t xml:space="preserve">Las recompensas variables, la respuesta inmediata y la ausencia de pausas son los mismos recursos que usan las redes sociales y, en versión más suave, muchas herramientas de gamificación escolar. La gamificación enseña que merece la pena lo que tiene premio. Un chico que lee para sumar puntos aprende a sumar puntos, igual que el niño de Sandel al que pagaban por leer.</w:t>
+        <w:t xml:space="preserve">Las recompensas variables, la respuesta inmediata y la ausencia de pausas son los mismos recursos que usan las redes sociales y, en versión más suave, algunas herramientas de gamificación escolar. Cuando el premio se convierte en la razón principal para participar, la actividad corre el riesgo de valer solo por la recompensa. Un chico que lee únicamente para sumar puntos aprende sobre todo a sumar puntos, como el niño de Sandel al que pagaban por leer.</w:t>
       </w:r>
     </w:p>
     <w:p>
@@ -4975,7 +4999,7 @@
         <w:t xml:space="preserve"> </w:t>
       </w:r>
       <w:r>
-        <w:t xml:space="preserve">Se juega por jugar, y por eso abre un espacio donde las reglas del mundo ordinario quedan en suspenso. La gamificación copia la forma del juego y le quita lo esencial. Como el sofista que vendía apariencia de sabiduría, vende apariencia de juego.</w:t>
+        <w:t xml:space="preserve">Se juega por jugar, y por eso abre un espacio donde las reglas del mundo ordinario quedan en suspenso. Esa gamificación copia la forma del juego y puede quitarle lo esencial: cuando todo cuenta para algo, ya no se juega por jugar. Como el sofista que vendía apariencia de sabiduría, corre el riesgo de vender apariencia de juego.</w:t>
       </w:r>
     </w:p>
     <w:p>
@@ -4990,7 +5014,7 @@
         <w:pStyle w:val="FirstParagraph"/>
       </w:pPr>
       <w:r>
-        <w:t xml:space="preserve">Lo que no tiene precio, pensaban los romanos, es lo que hace libre a una persona. El juego de Huizinga, la</w:t>
+        <w:t xml:space="preserve">Lo que no tiene precio, decía la vieja distinción de las artes liberales, es lo que hace libre a una persona. El juego de Huizinga, la</w:t>
       </w:r>
       <w:r>
         <w:t xml:space="preserve"> </w:t>
@@ -5094,7 +5118,7 @@
         <w:pStyle w:val="BodyText"/>
       </w:pPr>
       <w:r>
-        <w:t xml:space="preserve">Pienso en la chica del primer capítulo, la que abre la aplicación del instituto y encuentra un gráfico de barras antes que la tarea. A ella nadie le ha liberado el tiempo. Se lo han llenado. De las cuatro operaciones de la plataforma, la que más ha transformado la escuela es, creo, la que ordena el tiempo. Por ahí empieza, creo, cualquier resistencia que valga la pena.</w:t>
+        <w:t xml:space="preserve">Pienso en la chica del primer capítulo, la que abre la aplicación del instituto y encuentra un gráfico de barras antes que la tarea. A ella nadie le ha liberado el tiempo. Se lo han llenado. De las cuatro operaciones de la plataforma, la que más ha transformado la escuela es, creo, la que ordena el tiempo. Por ahí empieza cualquier resistencia que valga la pena.</w:t>
       </w:r>
     </w:p>
     <w:p>
@@ -5751,7 +5775,7 @@
         <w:pStyle w:val="BodyText"/>
       </w:pPr>
       <w:r>
-        <w:t xml:space="preserve">El dilema no se resuelve renunciando a una de las dos cosas. Se resuelve, creo, distinguiendo entre lo que la institución exige y lo que el alumno puede hacer. El límite tiene que caer sobre las exigencias: ningún plazo vence de noche, ningún aviso de la escuela llega a las diez, ningún docente está obligado a contestar el sábado. Lo que no debe cerrarse es el acceso. Los materiales y las entregas siguen disponibles para quien los necesite cuando pueda, sin que la hora quede anotada ni cuente a favor o en contra. Proteger el tiempo significa liberar a todos de la obligación de estar disponibles, y no impedir que alguien use el suyo como le haga falta.</w:t>
+        <w:t xml:space="preserve">El dilema no se resuelve renunciando a una de las dos cosas. Se resuelve, creo, distinguiendo entre lo que la institución exige y lo que el alumno puede hacer. El límite tiene que caer sobre las exigencias: ningún plazo vence de noche, ningún aviso de la escuela llega a las diez, ningún docente está obligado a contestar el sábado. Lo que no debe cerrarse es el acceso. Los materiales y las entregas siguen disponibles para quien los necesite cuando pueda, sin que la hora se convierta en un indicador de compromiso o de esfuerzo. Proteger el tiempo significa liberar a todos de la obligación de estar disponibles, y no impedir que alguien use el suyo como le haga falta.</w:t>
       </w:r>
     </w:p>
     <w:p>
@@ -5848,7 +5872,7 @@
         <w:pStyle w:val="BodyText"/>
       </w:pPr>
       <w:r>
-        <w:t xml:space="preserve">Lo que esos sistemas nos devuelven, sin embargo, es un perfil, y la distancia entre un perfil y el conocimiento de sí es la misma que separa al dispositivo de la educación. El perfil es lo que el sistema sabe de nosotros para gobernarnos. El conocimiento de sí es lo que llegamos a saber para gobernarnos nosotros y para no dejarnos gobernar de cualquier manera. El perfil predice el futuro a partir del pasado y por eso nos fija en lo que fuimos. Conocerse deja abierta la posibilidad de ser otro.</w:t>
+        <w:t xml:space="preserve">Lo que esos sistemas nos devuelven, sin embargo, es un perfil, y la distancia entre un perfil y el conocimiento de sí es la que separa un saber utilizado para conducir nuestra conducta de un conocimiento que nos permite interrogar esa conducción. El perfil es lo que el sistema sabe de nosotros para gobernarnos. El conocimiento de sí es lo que llegamos a saber para gobernarnos nosotros y para no dejarnos gobernar de cualquier manera. El perfil predice el futuro a partir del pasado y por eso nos fija en lo que fuimos. Conocerse deja abierta la posibilidad de ser otro.</w:t>
       </w:r>
     </w:p>
     <w:p>
@@ -5871,7 +5895,7 @@
         <w:pStyle w:val="BodyText"/>
       </w:pPr>
       <w:r>
-        <w:t xml:space="preserve">Entre la nota, el algoritmo, el ranking, la notificación y la inteligencia artificial generativa se están redefiniendo cuatro palabras que la escuela siempre tuvo a su cargo. Aprender se parece cada vez más a dejar huella: entregar, completar, conectarse, producir el rastro que el sistema sabe leer. Ser libre se confunde con elegir entre opciones que alguien ha dispuesto antes. Fracasar es quedar por debajo de la media en un gráfico que se consulta a solas, y vivirlo como una culpa privada. Y conocerse a uno mismo empieza a significar consultar el propio perfil.</w:t>
+        <w:t xml:space="preserve">Entre la nota, el algoritmo, el ranking, la notificación y la inteligencia artificial generativa se están redefiniendo cuatro palabras que la escuela ha tenido largamente a su cargo. Aprender se parece cada vez más a dejar huella: entregar, completar, conectarse, producir el rastro que el sistema sabe leer. Ser libre se confunde con elegir entre opciones que alguien ha dispuesto antes. Fracasar es quedar por debajo de la media en un gráfico que se consulta a solas, y vivirlo como una culpa privada. Y conocerse a uno mismo empieza a significar consultar el propio perfil.</w:t>
       </w:r>
     </w:p>
     <w:p>
@@ -5957,7 +5981,7 @@
         <w:pStyle w:val="BodyText"/>
       </w:pPr>
       <w:r>
-        <w:t xml:space="preserve">La escuela imprimió durante siglos su sello en la cera. Hoy nos pide que dejemos huella. Tal vez la tarea sea aprender de nuevo a hacer algo que no deje rastro y que, sin embargo, nos cambie: una conversación, una lectura, una pregunta que no se entrega a nadie.</w:t>
+        <w:t xml:space="preserve">La escuela imprimió durante siglos su sello en la cera. Hoy nos pide que dejemos huella. Tal vez la tarea sea recuperar también el derecho a hacer algo que no tenga que dejar un registro y que, sin embargo, nos cambie: una conversación, una lectura, una pregunta que no se entrega a nadie.</w:t>
       </w:r>
     </w:p>
     <w:p>
@@ -7112,7 +7136,23 @@
       </w:hyperlink>
       <w:bookmarkEnd w:id="191"/>
       <w:r>
-        <w:t xml:space="preserve">. Reglamento (UE) 2024/1689 (2024), art. 5.1.f y anexo III, punto 3. El aplazamiento procede del Reglamento (UE) 2026/1744 (2026), en vigor desde el 27 de julio de 2026.</w:t>
+        <w:t xml:space="preserve">. Reglamento (UE) 2024/1689 (2024), art. 5.1.f y anexo III, punto 3. El aplazamiento procede del Reglamento (UE) 2026/1744 (2026), que modifica las fechas de aplicación del art. 113 del Reglamento de IA; se publicó en el</w:t>
+      </w:r>
+      <w:r>
+        <w:t xml:space="preserve"> </w:t>
+      </w:r>
+      <w:r>
+        <w:rPr>
+          <w:iCs/>
+          <w:i/>
+        </w:rPr>
+        <w:t xml:space="preserve">Diario Oficial</w:t>
+      </w:r>
+      <w:r>
+        <w:t xml:space="preserve"> </w:t>
+      </w:r>
+      <w:r>
+        <w:t xml:space="preserve">el 24 de julio de 2026 y entró en vigor el 27 de julio.</w:t>
       </w:r>
     </w:p>
     <w:p>
@@ -8066,13 +8106,13 @@
           <w:bCs/>
           <w:b/>
         </w:rPr>
-        <w:t xml:space="preserve">Capital humano</w:t>
-      </w:r>
-      <w:r>
-        <w:t xml:space="preserve"> </w:t>
-      </w:r>
-      <w:r>
-        <w:t xml:space="preserve">(4). Idea de algunos economistas de la escuela de Chicago, como Theodore Schultz y Gary Becker, según la cual las habilidades, los conocimientos y la salud de una persona son un capital que puede invertirse y dar rendimiento. Aplicada a la educación, convierte estudiar en una inversión.</w:t>
+        <w:t xml:space="preserve">Alma</w:t>
+      </w:r>
+      <w:r>
+        <w:t xml:space="preserve"> </w:t>
+      </w:r>
+      <w:r>
+        <w:t xml:space="preserve">(prólogo, 1 y 3). En este libro no designa una sustancia separada del cuerpo. Es el nombre antiguo de aquello que la educación aspira a formar: una manera de percibir, de desear, de juzgar y de relacionarse con otros. El libro la encuentra en varios sentidos, como ideal de persona, como interioridad, como producto de las disciplinas y como relación consigo mismo.</w:t>
       </w:r>
     </w:p>
     <w:p>
@@ -8084,13 +8124,13 @@
           <w:bCs/>
           <w:b/>
         </w:rPr>
-        <w:t xml:space="preserve">Datificación</w:t>
-      </w:r>
-      <w:r>
-        <w:t xml:space="preserve"> </w:t>
-      </w:r>
-      <w:r>
-        <w:t xml:space="preserve">(5). Proceso por el que actividades humanas, como aprender, se convierten en datos que pueden registrarse, medirse y analizarse.</w:t>
+        <w:t xml:space="preserve">Capital humano</w:t>
+      </w:r>
+      <w:r>
+        <w:t xml:space="preserve"> </w:t>
+      </w:r>
+      <w:r>
+        <w:t xml:space="preserve">(4). Idea de algunos economistas de la escuela de Chicago, como Theodore Schultz y Gary Becker, según la cual las habilidades, los conocimientos y la salud de una persona son un capital que puede invertirse y dar rendimiento. Aplicada a la educación, convierte estudiar en una inversión.</w:t>
       </w:r>
     </w:p>
     <w:p>
@@ -8102,13 +8142,13 @@
           <w:bCs/>
           <w:b/>
         </w:rPr>
-        <w:t xml:space="preserve">Dispositivo</w:t>
-      </w:r>
-      <w:r>
-        <w:t xml:space="preserve"> </w:t>
-      </w:r>
-      <w:r>
-        <w:t xml:space="preserve">(2). En el sentido de Michel Foucault, una red de elementos muy distintos (leyes, edificios, saberes, objetos, costumbres) que surge en un momento histórico para responder a un problema y que, al funcionar, produce un tipo determinado de persona. Un móvil es un dispositivo en el sentido técnico; la red de relaciones que lo rodea lo es en el sentido filosófico.</w:t>
+        <w:t xml:space="preserve">Datificación</w:t>
+      </w:r>
+      <w:r>
+        <w:t xml:space="preserve"> </w:t>
+      </w:r>
+      <w:r>
+        <w:t xml:space="preserve">(5). Proceso por el que actividades humanas, como aprender, se convierten en datos que pueden registrarse, medirse y analizarse.</w:t>
       </w:r>
     </w:p>
     <w:p>
@@ -8120,13 +8160,13 @@
           <w:bCs/>
           <w:b/>
         </w:rPr>
-        <w:t xml:space="preserve">Dividuo</w:t>
-      </w:r>
-      <w:r>
-        <w:t xml:space="preserve"> </w:t>
-      </w:r>
-      <w:r>
-        <w:t xml:space="preserve">(5). Término de Gilles Deleuze para el sujeto de las sociedades de control: alguien que ya no se trata como una persona entera, sino como un conjunto de datos que pueden separarse y analizarse por partes.</w:t>
+        <w:t xml:space="preserve">Dispositivo</w:t>
+      </w:r>
+      <w:r>
+        <w:t xml:space="preserve"> </w:t>
+      </w:r>
+      <w:r>
+        <w:t xml:space="preserve">(2). En el sentido de Michel Foucault, una red de elementos muy distintos (leyes, edificios, saberes, objetos, costumbres) que surge en un momento histórico para responder a un problema y que, al funcionar, produce un tipo determinado de persona. Un móvil es un dispositivo en el sentido técnico; la red de relaciones que lo rodea lo es en el sentido filosófico.</w:t>
       </w:r>
     </w:p>
     <w:p>
@@ -8138,45 +8178,13 @@
           <w:bCs/>
           <w:b/>
         </w:rPr>
-        <w:t xml:space="preserve">Edutropía</w:t>
-      </w:r>
-      <w:r>
-        <w:t xml:space="preserve"> </w:t>
-      </w:r>
-      <w:r>
-        <w:t xml:space="preserve">(8). Palabra que propongo, formada con</w:t>
-      </w:r>
-      <w:r>
-        <w:t xml:space="preserve"> </w:t>
-      </w:r>
-      <w:r>
-        <w:rPr>
-          <w:iCs/>
-          <w:i/>
-        </w:rPr>
-        <w:t xml:space="preserve">edu</w:t>
-      </w:r>
-      <w:r>
-        <w:t xml:space="preserve"> </w:t>
-      </w:r>
-      <w:r>
-        <w:t xml:space="preserve">(educación) y</w:t>
-      </w:r>
-      <w:r>
-        <w:t xml:space="preserve"> </w:t>
-      </w:r>
-      <w:r>
-        <w:rPr>
-          <w:iCs/>
-          <w:i/>
-        </w:rPr>
-        <w:t xml:space="preserve">tropos</w:t>
-      </w:r>
-      <w:r>
-        <w:t xml:space="preserve"> </w:t>
-      </w:r>
-      <w:r>
-        <w:t xml:space="preserve">(giro). A diferencia de una utopía, no describe una escuela perfecta, sino una orientación posible: devolver a la escuela tiempo, cuidado, privacidad y deliberación colectiva, sin perder de vista la igualdad.</w:t>
+        <w:t xml:space="preserve">Dividuo</w:t>
+      </w:r>
+      <w:r>
+        <w:t xml:space="preserve"> </w:t>
+      </w:r>
+      <w:r>
+        <w:t xml:space="preserve">(5). Término de Gilles Deleuze para el sujeto de las sociedades de control: alguien que ya no se trata como una persona entera, sino como un conjunto de datos que pueden separarse y analizarse por partes.</w:t>
       </w:r>
     </w:p>
     <w:p>
@@ -8188,13 +8196,45 @@
           <w:bCs/>
           <w:b/>
         </w:rPr>
-        <w:t xml:space="preserve">Empresario de sí mismo</w:t>
-      </w:r>
-      <w:r>
-        <w:t xml:space="preserve"> </w:t>
-      </w:r>
-      <w:r>
-        <w:t xml:space="preserve">(4). Figura descrita por Foucault a partir de la teoría del capital humano: la persona que se trata a sí misma como una empresa, gestiona su vida como una inversión y se evalúa según su rendimiento. Las plataformas le dan los instrumentos para hacerlo de forma continua.</w:t>
+        <w:t xml:space="preserve">Edutropía</w:t>
+      </w:r>
+      <w:r>
+        <w:t xml:space="preserve"> </w:t>
+      </w:r>
+      <w:r>
+        <w:t xml:space="preserve">(8). Palabra que propongo, formada con</w:t>
+      </w:r>
+      <w:r>
+        <w:t xml:space="preserve"> </w:t>
+      </w:r>
+      <w:r>
+        <w:rPr>
+          <w:iCs/>
+          <w:i/>
+        </w:rPr>
+        <w:t xml:space="preserve">edu</w:t>
+      </w:r>
+      <w:r>
+        <w:t xml:space="preserve"> </w:t>
+      </w:r>
+      <w:r>
+        <w:t xml:space="preserve">(educación) y</w:t>
+      </w:r>
+      <w:r>
+        <w:t xml:space="preserve"> </w:t>
+      </w:r>
+      <w:r>
+        <w:rPr>
+          <w:iCs/>
+          <w:i/>
+        </w:rPr>
+        <w:t xml:space="preserve">tropos</w:t>
+      </w:r>
+      <w:r>
+        <w:t xml:space="preserve"> </w:t>
+      </w:r>
+      <w:r>
+        <w:t xml:space="preserve">(giro). A diferencia de una utopía, no describe una escuela perfecta, sino una orientación posible: devolver a la escuela tiempo, cuidado, privacidad y deliberación colectiva, sin perder de vista la igualdad.</w:t>
       </w:r>
     </w:p>
     <w:p>
@@ -8206,13 +8246,13 @@
           <w:bCs/>
           <w:b/>
         </w:rPr>
-        <w:t xml:space="preserve">Gamificación</w:t>
-      </w:r>
-      <w:r>
-        <w:t xml:space="preserve"> </w:t>
-      </w:r>
-      <w:r>
-        <w:t xml:space="preserve">(7). Uso de elementos propios de los juegos (puntos, niveles, insignias, clasificaciones) en actividades que no son juegos, como aprender o trabajar, para dirigir la conducta.</w:t>
+        <w:t xml:space="preserve">Empresario de sí mismo</w:t>
+      </w:r>
+      <w:r>
+        <w:t xml:space="preserve"> </w:t>
+      </w:r>
+      <w:r>
+        <w:t xml:space="preserve">(4). Figura descrita por Foucault a partir de la teoría del capital humano: la persona que se trata a sí misma como una empresa, gestiona su vida como una inversión y se evalúa según su rendimiento. Las plataformas le dan los instrumentos para hacerlo de forma continua.</w:t>
       </w:r>
     </w:p>
     <w:p>
@@ -8224,46 +8264,31 @@
           <w:bCs/>
           <w:b/>
         </w:rPr>
-        <w:t xml:space="preserve">Neoliberalismo</w:t>
-      </w:r>
-      <w:r>
-        <w:t xml:space="preserve"> </w:t>
-      </w:r>
-      <w:r>
-        <w:t xml:space="preserve">(4 y 7). En este libro, la idea de que el mercado y la competencia deben organizar no solo la economía sino el conjunto de la vida social, y de que el Estado debe crear activamente las condiciones para ello. Más que una política económica, una manera de entender a las personas.</w:t>
-      </w:r>
-    </w:p>
-    <w:p>
-      <w:pPr>
-        <w:pStyle w:val="BodyText"/>
-      </w:pPr>
-      <w:r>
-        <w:rPr>
-          <w:iCs/>
-          <w:i/>
+        <w:t xml:space="preserve">Gamificación</w:t>
+      </w:r>
+      <w:r>
+        <w:t xml:space="preserve"> </w:t>
+      </w:r>
+      <w:r>
+        <w:t xml:space="preserve">(7). Uso de elementos propios de los juegos (puntos, niveles, insignias, clasificaciones) en actividades que no son juegos, como aprender o trabajar, para dirigir la conducta.</w:t>
+      </w:r>
+    </w:p>
+    <w:p>
+      <w:pPr>
+        <w:pStyle w:val="BodyText"/>
+      </w:pPr>
+      <w:r>
+        <w:rPr>
           <w:bCs/>
           <w:b/>
         </w:rPr>
-        <w:t xml:space="preserve">Oikonomía</w:t>
-      </w:r>
-      <w:r>
-        <w:t xml:space="preserve"> </w:t>
-      </w:r>
-      <w:r>
-        <w:t xml:space="preserve">(2). Palabra griega para la administración de la casa. Giorgio Agamben muestra que los teólogos cristianos la usaron para pensar el gobierno divino del mundo y que de su traducción latina,</w:t>
-      </w:r>
-      <w:r>
-        <w:t xml:space="preserve"> </w:t>
-      </w:r>
-      <w:r>
-        <w:rPr>
-          <w:iCs/>
-          <w:i/>
-        </w:rPr>
-        <w:t xml:space="preserve">dispositio</w:t>
-      </w:r>
-      <w:r>
-        <w:t xml:space="preserve">, viene «dispositivo».</w:t>
+        <w:t xml:space="preserve">Neoliberalismo</w:t>
+      </w:r>
+      <w:r>
+        <w:t xml:space="preserve"> </w:t>
+      </w:r>
+      <w:r>
+        <w:t xml:space="preserve">(4 y 7). En este libro, la idea de que el mercado y la competencia deben organizar no solo la economía sino el conjunto de la vida social, y de que el Estado debe crear activamente las condiciones para ello. Más que una política económica, una manera de entender a las personas.</w:t>
       </w:r>
     </w:p>
     <w:p>
@@ -8277,31 +8302,46 @@
           <w:bCs/>
           <w:b/>
         </w:rPr>
-        <w:t xml:space="preserve">Paideia</w:t>
-      </w:r>
-      <w:r>
-        <w:t xml:space="preserve"> </w:t>
-      </w:r>
-      <w:r>
-        <w:t xml:space="preserve">(1). Palabra griega que designaba a la vez la educación de los jóvenes, la cultura de un pueblo y el ideal de ser humano al que aspiraba esa cultura.</w:t>
-      </w:r>
-    </w:p>
-    <w:p>
-      <w:pPr>
-        <w:pStyle w:val="BodyText"/>
-      </w:pPr>
-      <w:r>
-        <w:rPr>
+        <w:t xml:space="preserve">Oikonomía</w:t>
+      </w:r>
+      <w:r>
+        <w:t xml:space="preserve"> </w:t>
+      </w:r>
+      <w:r>
+        <w:t xml:space="preserve">(2). Palabra griega para la administración de la casa. Giorgio Agamben muestra que los teólogos cristianos la usaron para pensar el gobierno divino del mundo y que de su traducción latina,</w:t>
+      </w:r>
+      <w:r>
+        <w:t xml:space="preserve"> </w:t>
+      </w:r>
+      <w:r>
+        <w:rPr>
+          <w:iCs/>
+          <w:i/>
+        </w:rPr>
+        <w:t xml:space="preserve">dispositio</w:t>
+      </w:r>
+      <w:r>
+        <w:t xml:space="preserve">, viene «dispositivo».</w:t>
+      </w:r>
+    </w:p>
+    <w:p>
+      <w:pPr>
+        <w:pStyle w:val="BodyText"/>
+      </w:pPr>
+      <w:r>
+        <w:rPr>
+          <w:iCs/>
+          <w:i/>
           <w:bCs/>
           <w:b/>
         </w:rPr>
-        <w:t xml:space="preserve">Pedagogía de la huella</w:t>
-      </w:r>
-      <w:r>
-        <w:t xml:space="preserve"> </w:t>
-      </w:r>
-      <w:r>
-        <w:t xml:space="preserve">(prólogo, 2, 4 y 5). Nombre que doy a una inversión, no a cualquier enseñanza que pide trabajos o guarda registros. La escuela siempre produjo evidencias para conversar sobre lo aprendido y registró actividad para organizarse. Hay pedagogía de la huella cuando lo que puede registrarse empieza a decidir qué se reconoce como aprendizaje, el registro se convierte en criterio para valorar a la persona y producir rastros pasa a ser una obligación permanente.</w:t>
+        <w:t xml:space="preserve">Paideia</w:t>
+      </w:r>
+      <w:r>
+        <w:t xml:space="preserve"> </w:t>
+      </w:r>
+      <w:r>
+        <w:t xml:space="preserve">(1). Palabra griega que designaba a la vez la educación de los jóvenes, la cultura de un pueblo y el ideal de ser humano al que aspiraba esa cultura.</w:t>
       </w:r>
     </w:p>
     <w:p>
@@ -8313,82 +8353,100 @@
           <w:bCs/>
           <w:b/>
         </w:rPr>
-        <w:t xml:space="preserve">Performatividad</w:t>
-      </w:r>
-      <w:r>
-        <w:t xml:space="preserve"> </w:t>
-      </w:r>
-      <w:r>
-        <w:t xml:space="preserve">(4). En el sentido de Stephen Ball, una cultura de trabajo en la que se juzga a las personas, sobre todo a los docentes, por los resultados que pueden exhibir.</w:t>
-      </w:r>
-    </w:p>
-    <w:p>
-      <w:pPr>
-        <w:pStyle w:val="BodyText"/>
-      </w:pPr>
-      <w:r>
-        <w:rPr>
-          <w:iCs/>
-          <w:i/>
+        <w:t xml:space="preserve">Pedagogía de la huella</w:t>
+      </w:r>
+      <w:r>
+        <w:t xml:space="preserve"> </w:t>
+      </w:r>
+      <w:r>
+        <w:t xml:space="preserve">(prólogo, 2, 4 y 5). Nombre que doy a una inversión, no a cualquier enseñanza que pide trabajos o guarda registros. La escuela siempre produjo evidencias para conversar sobre lo aprendido y registró actividad para organizarse. Hay pedagogía de la huella cuando lo que puede registrarse empieza a decidir qué se reconoce como aprendizaje, el registro se convierte en criterio para valorar a la persona y producir rastros pasa a ser una obligación permanente.</w:t>
+      </w:r>
+    </w:p>
+    <w:p>
+      <w:pPr>
+        <w:pStyle w:val="BodyText"/>
+      </w:pPr>
+      <w:r>
+        <w:rPr>
           <w:bCs/>
           <w:b/>
         </w:rPr>
-        <w:t xml:space="preserve">Pharmakon</w:t>
-      </w:r>
-      <w:r>
-        <w:t xml:space="preserve"> </w:t>
-      </w:r>
-      <w:r>
-        <w:t xml:space="preserve">(6). Palabra griega que significa a la vez remedio y veneno. Platón la aplica a la escritura; Derrida y Stiegler, a toda técnica.</w:t>
-      </w:r>
-    </w:p>
-    <w:p>
-      <w:pPr>
-        <w:pStyle w:val="BodyText"/>
-      </w:pPr>
-      <w:r>
-        <w:rPr>
+        <w:t xml:space="preserve">Performatividad</w:t>
+      </w:r>
+      <w:r>
+        <w:t xml:space="preserve"> </w:t>
+      </w:r>
+      <w:r>
+        <w:t xml:space="preserve">(4). En el sentido de Stephen Ball, una cultura de trabajo en la que se juzga a las personas, sobre todo a los docentes, por los resultados que pueden exhibir.</w:t>
+      </w:r>
+    </w:p>
+    <w:p>
+      <w:pPr>
+        <w:pStyle w:val="BodyText"/>
+      </w:pPr>
+      <w:r>
+        <w:rPr>
+          <w:iCs/>
+          <w:i/>
           <w:bCs/>
           <w:b/>
         </w:rPr>
-        <w:t xml:space="preserve">Plataforma educativa</w:t>
-      </w:r>
-      <w:r>
-        <w:t xml:space="preserve"> </w:t>
-      </w:r>
-      <w:r>
-        <w:t xml:space="preserve">(prólogo y 2). Infraestructura digital que organiza o condiciona lo que ocurre en la escuela: la comunicación, los contenidos, las tareas, la evaluación, el seguimiento de los alumnos y los datos que se recogen sobre ellos. Todas ordenan el tiempo, deciden qué se ve, organizan las relaciones y convierten la actividad en medida, pero no todas pertenecen a los mismos dueños ni usan las huellas para lo mismo.</w:t>
-      </w:r>
-    </w:p>
-    <w:p>
-      <w:pPr>
-        <w:pStyle w:val="BodyText"/>
-      </w:pPr>
-      <w:r>
-        <w:rPr>
-          <w:iCs/>
-          <w:i/>
+        <w:t xml:space="preserve">Pharmakon</w:t>
+      </w:r>
+      <w:r>
+        <w:t xml:space="preserve"> </w:t>
+      </w:r>
+      <w:r>
+        <w:t xml:space="preserve">(6). Palabra griega que significa a la vez remedio y veneno. Platón la aplica a la escritura; Derrida y Stiegler, a toda técnica.</w:t>
+      </w:r>
+    </w:p>
+    <w:p>
+      <w:pPr>
+        <w:pStyle w:val="BodyText"/>
+      </w:pPr>
+      <w:r>
+        <w:rPr>
           <w:bCs/>
           <w:b/>
         </w:rPr>
-        <w:t xml:space="preserve">Skholé</w:t>
-      </w:r>
-      <w:r>
-        <w:t xml:space="preserve"> </w:t>
-      </w:r>
-      <w:r>
-        <w:t xml:space="preserve">(1 y 8). Palabra griega que significaba ocio, tiempo libre de la necesidad, y de la que deriva «escuela».</w:t>
-      </w:r>
-    </w:p>
-    <w:p>
-      <w:pPr>
-        <w:pStyle w:val="BodyText"/>
-      </w:pPr>
-      <w:r>
-        <w:rPr>
+        <w:t xml:space="preserve">Plataforma educativa</w:t>
+      </w:r>
+      <w:r>
+        <w:t xml:space="preserve"> </w:t>
+      </w:r>
+      <w:r>
+        <w:t xml:space="preserve">(prólogo y 2). Infraestructura digital que organiza o condiciona lo que ocurre en la escuela: la comunicación, los contenidos, las tareas, la evaluación, el seguimiento de los alumnos y los datos que se recogen sobre ellos. Todas ordenan el tiempo, deciden qué se ve, organizan las relaciones y convierten la actividad en medida, pero no todas pertenecen a los mismos dueños ni usan las huellas para lo mismo.</w:t>
+      </w:r>
+    </w:p>
+    <w:p>
+      <w:pPr>
+        <w:pStyle w:val="BodyText"/>
+      </w:pPr>
+      <w:r>
+        <w:rPr>
+          <w:iCs/>
+          <w:i/>
           <w:bCs/>
           <w:b/>
         </w:rPr>
+        <w:t xml:space="preserve">Skholé</w:t>
+      </w:r>
+      <w:r>
+        <w:t xml:space="preserve"> </w:t>
+      </w:r>
+      <w:r>
+        <w:t xml:space="preserve">(1 y 8). Palabra griega que significaba ocio, tiempo libre de la necesidad, y de la que deriva «escuela».</w:t>
+      </w:r>
+    </w:p>
+    <w:p>
+      <w:pPr>
+        <w:pStyle w:val="BodyText"/>
+      </w:pPr>
+      <w:r>
+        <w:rPr>
+          <w:bCs/>
+          <w:b/>
+        </w:rPr>
         <w:t xml:space="preserve">Subjetivación</w:t>
       </w:r>
       <w:r>
@@ -10701,7 +10759,7 @@
         <w:t xml:space="preserve">Diario Oficial de la República de Chile</w:t>
       </w:r>
       <w:r>
-        <w:t xml:space="preserve">. https://www.bcn.cl/leychile</w:t>
+        <w:t xml:space="preserve">. https://www.bcn.cl/leychile/navegar?idLey=20370</w:t>
       </w:r>
     </w:p>
     <w:p>
@@ -10726,7 +10784,7 @@
         <w:t xml:space="preserve">Diario Oficial de la República de Chile</w:t>
       </w:r>
       <w:r>
-        <w:t xml:space="preserve">. https://www.bcn.cl/leychile</w:t>
+        <w:t xml:space="preserve">. https://www.bcn.cl/leychile/navegar?idLey=20845</w:t>
       </w:r>
     </w:p>
     <w:p>
@@ -10751,7 +10809,7 @@
         <w:t xml:space="preserve">Diario Oficial de la República de Chile</w:t>
       </w:r>
       <w:r>
-        <w:t xml:space="preserve">. https://www.bcn.cl/leychile</w:t>
+        <w:t xml:space="preserve">. https://www.bcn.cl/leychile/navegar?idLey=20903</w:t>
       </w:r>
     </w:p>
     <w:p>
@@ -10776,7 +10834,7 @@
         <w:t xml:space="preserve">Diario Oficial de la República de Chile</w:t>
       </w:r>
       <w:r>
-        <w:t xml:space="preserve">. https://www.bcn.cl/leychile</w:t>
+        <w:t xml:space="preserve">. https://www.bcn.cl/leychile/navegar?idLey=21040</w:t>
       </w:r>
     </w:p>
     <w:p>
@@ -10801,7 +10859,7 @@
         <w:t xml:space="preserve">Diario Oficial de la República de Chile</w:t>
       </w:r>
       <w:r>
-        <w:t xml:space="preserve">. https://www.bcn.cl/leychile</w:t>
+        <w:t xml:space="preserve">. https://www.bcn.cl/leychile/navegar?idLey=21728</w:t>
       </w:r>
     </w:p>
     <w:p>
@@ -11419,7 +11477,7 @@
         <w:t xml:space="preserve">Diario Oficial de la Unión Europea</w:t>
       </w:r>
       <w:r>
-        <w:t xml:space="preserve">, L, 2026/1744. http://data.europa.eu/eli/reg/2026/1744/oj</w:t>
+        <w:t xml:space="preserve">, L, 2026/1744, de 24 de julio de 2026. http://data.europa.eu/eli/reg/2026/1744/oj</w:t>
       </w:r>
     </w:p>
     <w:p>

</xml_diff>

<commit_message>
PDF: partición selectiva, enlaces de notas precisos y URL activas
- Chromium no parte palabras en español y estiraba líneas justificadas
  (p. 52, cita de la filósofa chilena). compilar.sh detecta ahora esas
  líneas en el PDF y añade partición solo a la palabra que no cupo, con
  pyphen, hasta que no queda ninguna (lineas_estiradas.py, guionado.py).
- Los destinos de las llamadas de nota y de sus retornos se recolocan
  teniendo en cuenta los márgenes de la página (destinos_pdf.py).
- Las URL de la bibliografía son enlaces activos en PDF, HTML, EPUB y
  DOCX, y en el PDF se cortan solo tras barra o antes de punto o guion
  (cortes-url.lua).
- Prólogo: se suprime «Ha cambiado de instrumentos…».

Co-Authored-By: Claude Opus 5.5 <noreply@anthropic.com>
Claude-Session: https://claude.ai/code/session_01Qu4vbrz7BffupnAMtng73g
</commit_message>
<xml_diff>
--- a/salida/el-alma-en-la-plataforma.docx
+++ b/salida/el-alma-en-la-plataforma.docx
@@ -276,7 +276,7 @@
         <w:pStyle w:val="BodyText"/>
       </w:pPr>
       <w:r>
-        <w:t xml:space="preserve">Uso una palabra deliberadamente antigua, alma, sin suponer una sustancia separada del cuerpo. Me interesa porque durante siglos nombró aquello que la educación aspiraba a formar: una manera de percibir, de desear, de juzgar y de relacionarse con otros. Hoy hablamos de competencias y de perfiles, pero esa formación no ha desaparecido. Ha cambiado de instrumentos, y este libro trata de algunos de ellos.</w:t>
+        <w:t xml:space="preserve">Uso una palabra deliberadamente antigua, alma, sin suponer una sustancia separada del cuerpo. Me interesa porque durante siglos nombró aquello que la educación aspiraba a formar: una manera de percibir, de desear, de juzgar y de relacionarse con otros. Hoy hablamos de competencias y de perfiles, pero esa formación no ha desaparecido.</w:t>
       </w:r>
     </w:p>
     <w:p>
@@ -6103,7 +6103,7 @@
       </w:r>
     </w:p>
     <w:bookmarkEnd w:id="134"/>
-    <w:bookmarkStart w:id="137" w:name="bibliografia"/>
+    <w:bookmarkStart w:id="202" w:name="bibliografia"/>
     <w:p>
       <w:pPr>
         <w:pStyle w:val="Heading1"/>
@@ -6410,7 +6410,7 @@
       </w:r>
     </w:p>
     <w:bookmarkEnd w:id="135"/>
-    <w:bookmarkStart w:id="136" w:name="referencias"/>
+    <w:bookmarkStart w:id="201" w:name="referencias"/>
     <w:p>
       <w:pPr>
         <w:pStyle w:val="Heading2"/>
@@ -6550,8 +6550,19 @@
         <w:t xml:space="preserve">Suite educativa DD: Digitalización democrática</w:t>
       </w:r>
       <w:r>
-        <w:t xml:space="preserve">. https://ajuntament.barcelona.cat/innovaciodemocratica/es/suite-educativa-dd-digitalizacion-democratica</w:t>
-      </w:r>
+        <w:t xml:space="preserve">.</w:t>
+      </w:r>
+      <w:r>
+        <w:t xml:space="preserve"> </w:t>
+      </w:r>
+      <w:hyperlink r:id="rId136">
+        <w:r>
+          <w:rPr>
+            <w:rStyle w:val="Hyperlink"/>
+          </w:rPr>
+          <w:t xml:space="preserve">https://ajuntament.barcelona.cat/innovaciodemocratica/es/suite-educativa-dd-digitalizacion-democratica</w:t>
+        </w:r>
+      </w:hyperlink>
     </w:p>
     <w:p>
       <w:pPr>
@@ -6690,8 +6701,19 @@
         <w:t xml:space="preserve"> </w:t>
       </w:r>
       <w:r>
-        <w:t xml:space="preserve">(pp. 267-270). Association for Computing Machinery. https://doi.org/10.1145/2330601.2330666</w:t>
-      </w:r>
+        <w:t xml:space="preserve">(pp. 267-270). Association for Computing Machinery.</w:t>
+      </w:r>
+      <w:r>
+        <w:t xml:space="preserve"> </w:t>
+      </w:r>
+      <w:hyperlink r:id="rId137">
+        <w:r>
+          <w:rPr>
+            <w:rStyle w:val="Hyperlink"/>
+          </w:rPr>
+          <w:t xml:space="preserve">https://doi.org/10.1145/2330601.2330666</w:t>
+        </w:r>
+      </w:hyperlink>
     </w:p>
     <w:p>
       <w:pPr>
@@ -6728,8 +6750,19 @@
         <w:t xml:space="preserve">7</w:t>
       </w:r>
       <w:r>
-        <w:t xml:space="preserve">(3), 288-307. https://doi.org/10.1057/sub.2014.12</w:t>
-      </w:r>
+        <w:t xml:space="preserve">(3), 288-307.</w:t>
+      </w:r>
+      <w:r>
+        <w:t xml:space="preserve"> </w:t>
+      </w:r>
+      <w:hyperlink r:id="rId138">
+        <w:r>
+          <w:rPr>
+            <w:rStyle w:val="Hyperlink"/>
+          </w:rPr>
+          <w:t xml:space="preserve">https://doi.org/10.1057/sub.2014.12</w:t>
+        </w:r>
+      </w:hyperlink>
     </w:p>
     <w:p>
       <w:pPr>
@@ -6766,8 +6799,19 @@
         <w:t xml:space="preserve">18</w:t>
       </w:r>
       <w:r>
-        <w:t xml:space="preserve">(2), 215-228. https://doi.org/10.1080/0268093022000043065</w:t>
-      </w:r>
+        <w:t xml:space="preserve">(2), 215-228.</w:t>
+      </w:r>
+      <w:r>
+        <w:t xml:space="preserve"> </w:t>
+      </w:r>
+      <w:hyperlink r:id="rId139">
+        <w:r>
+          <w:rPr>
+            <w:rStyle w:val="Hyperlink"/>
+          </w:rPr>
+          <w:t xml:space="preserve">https://doi.org/10.1080/0268093022000043065</w:t>
+        </w:r>
+      </w:hyperlink>
     </w:p>
     <w:p>
       <w:pPr>
@@ -6804,8 +6848,19 @@
         <w:t xml:space="preserve">122</w:t>
       </w:r>
       <w:r>
-        <w:t xml:space="preserve">(26), Artículo e2422633122. https://doi.org/10.1073/pnas.2422633122</w:t>
-      </w:r>
+        <w:t xml:space="preserve">(26), Artículo e2422633122.</w:t>
+      </w:r>
+      <w:r>
+        <w:t xml:space="preserve"> </w:t>
+      </w:r>
+      <w:hyperlink r:id="rId140">
+        <w:r>
+          <w:rPr>
+            <w:rStyle w:val="Hyperlink"/>
+          </w:rPr>
+          <w:t xml:space="preserve">https://doi.org/10.1073/pnas.2422633122</w:t>
+        </w:r>
+      </w:hyperlink>
     </w:p>
     <w:p>
       <w:pPr>
@@ -6945,8 +7000,19 @@
         <w:t xml:space="preserve">50</w:t>
       </w:r>
       <w:r>
-        <w:t xml:space="preserve">(1), 75-87. https://doi.org/10.1111/ejed.12109</w:t>
-      </w:r>
+        <w:t xml:space="preserve">(1), 75-87.</w:t>
+      </w:r>
+      <w:r>
+        <w:t xml:space="preserve"> </w:t>
+      </w:r>
+      <w:hyperlink r:id="rId141">
+        <w:r>
+          <w:rPr>
+            <w:rStyle w:val="Hyperlink"/>
+          </w:rPr>
+          <w:t xml:space="preserve">https://doi.org/10.1111/ejed.12109</w:t>
+        </w:r>
+      </w:hyperlink>
     </w:p>
     <w:p>
       <w:pPr>
@@ -7008,8 +7074,19 @@
         <w:t xml:space="preserve">Why the Course Signals math does not add up</w:t>
       </w:r>
       <w:r>
-        <w:t xml:space="preserve">. Hapgood. https://hapgood.us/2013/09/26/why-the-course-signals-math-does-not-add-up/</w:t>
-      </w:r>
+        <w:t xml:space="preserve">. Hapgood.</w:t>
+      </w:r>
+      <w:r>
+        <w:t xml:space="preserve"> </w:t>
+      </w:r>
+      <w:hyperlink r:id="rId142">
+        <w:r>
+          <w:rPr>
+            <w:rStyle w:val="Hyperlink"/>
+          </w:rPr>
+          <w:t xml:space="preserve">https://hapgood.us/2013/09/26/why-the-course-signals-math-does-not-add-up/</w:t>
+        </w:r>
+      </w:hyperlink>
     </w:p>
     <w:p>
       <w:pPr>
@@ -7033,8 +7110,19 @@
         <w:t xml:space="preserve">A simple, less mathematical way to understand the Course Signals issue</w:t>
       </w:r>
       <w:r>
-        <w:t xml:space="preserve">. Hapgood. https://hapgood.us/2013/09/26/a-simple-less-mathematical-way-to-understand-the-course-signals-issue/</w:t>
-      </w:r>
+        <w:t xml:space="preserve">. Hapgood.</w:t>
+      </w:r>
+      <w:r>
+        <w:t xml:space="preserve"> </w:t>
+      </w:r>
+      <w:hyperlink r:id="rId143">
+        <w:r>
+          <w:rPr>
+            <w:rStyle w:val="Hyperlink"/>
+          </w:rPr>
+          <w:t xml:space="preserve">https://hapgood.us/2013/09/26/a-simple-less-mathematical-way-to-understand-the-course-signals-issue/</w:t>
+        </w:r>
+      </w:hyperlink>
     </w:p>
     <w:p>
       <w:pPr>
@@ -7114,8 +7202,19 @@
         <w:t xml:space="preserve">Guidance on AI detection and why we’re disabling Turnitin’s AI detector</w:t>
       </w:r>
       <w:r>
-        <w:t xml:space="preserve">. Vanderbilt University, Brightspace Support. https://www.vanderbilt.edu/brightspace/2023/08/16/guidance-on-ai-detection-and-why-were-disabling-turnitins-ai-detector/</w:t>
-      </w:r>
+        <w:t xml:space="preserve">. Vanderbilt University, Brightspace Support.</w:t>
+      </w:r>
+      <w:r>
+        <w:t xml:space="preserve"> </w:t>
+      </w:r>
+      <w:hyperlink r:id="rId144">
+        <w:r>
+          <w:rPr>
+            <w:rStyle w:val="Hyperlink"/>
+          </w:rPr>
+          <w:t xml:space="preserve">https://www.vanderbilt.edu/brightspace/2023/08/16/guidance-on-ai-detection-and-why-were-disabling-turnitins-ai-detector/</w:t>
+        </w:r>
+      </w:hyperlink>
     </w:p>
     <w:p>
       <w:pPr>
@@ -7167,8 +7266,19 @@
         <w:t xml:space="preserve">EducaMadrid</w:t>
       </w:r>
       <w:r>
-        <w:t xml:space="preserve">. https://www.comunidad.madrid/servicios/educacion/educamadrid</w:t>
-      </w:r>
+        <w:t xml:space="preserve">.</w:t>
+      </w:r>
+      <w:r>
+        <w:t xml:space="preserve"> </w:t>
+      </w:r>
+      <w:hyperlink r:id="rId145">
+        <w:r>
+          <w:rPr>
+            <w:rStyle w:val="Hyperlink"/>
+          </w:rPr>
+          <w:t xml:space="preserve">https://www.comunidad.madrid/servicios/educacion/educamadrid</w:t>
+        </w:r>
+      </w:hyperlink>
     </w:p>
     <w:p>
       <w:pPr>
@@ -7192,8 +7302,19 @@
         <w:t xml:space="preserve">Boletín Oficial del Estado</w:t>
       </w:r>
       <w:r>
-        <w:t xml:space="preserve">, 311, de 29 de diciembre de 1978. https://www.boe.es/eli/es/c/1978/12/27/(1)/con</w:t>
-      </w:r>
+        <w:t xml:space="preserve">, 311, de 29 de diciembre de 1978.</w:t>
+      </w:r>
+      <w:r>
+        <w:t xml:space="preserve"> </w:t>
+      </w:r>
+      <w:hyperlink r:id="rId146">
+        <w:r>
+          <w:rPr>
+            <w:rStyle w:val="Hyperlink"/>
+          </w:rPr>
+          <w:t xml:space="preserve">https://www.boe.es/eli/es/c/1978/12/27/(1)/con</w:t>
+        </w:r>
+      </w:hyperlink>
     </w:p>
     <w:p>
       <w:pPr>
@@ -7248,8 +7369,19 @@
         <w:t xml:space="preserve"> </w:t>
       </w:r>
       <w:r>
-        <w:t xml:space="preserve">(expediente 2020-431-0061). https://www.datatilsynet.dk/afgoerelser/afgoerelser/2022/jul/datatilsynet-nedlaegger-behandlingsforbud-i-chromebook-sag-</w:t>
-      </w:r>
+        <w:t xml:space="preserve">(expediente 2020-431-0061).</w:t>
+      </w:r>
+      <w:r>
+        <w:t xml:space="preserve"> </w:t>
+      </w:r>
+      <w:hyperlink r:id="rId147">
+        <w:r>
+          <w:rPr>
+            <w:rStyle w:val="Hyperlink"/>
+          </w:rPr>
+          <w:t xml:space="preserve">https://www.datatilsynet.dk/afgoerelser/afgoerelser/2022/jul/datatilsynet-nedlaegger-behandlingsforbud-i-chromebook-sag-</w:t>
+        </w:r>
+      </w:hyperlink>
     </w:p>
     <w:p>
       <w:pPr>
@@ -7273,8 +7405,19 @@
         <w:t xml:space="preserve">Datatilsynet fastholder forbud i Chromebook-sag</w:t>
       </w:r>
       <w:r>
-        <w:t xml:space="preserve">. https://www.datatilsynet.dk/afgoerelser/afgoerelser/2022/aug/datatilsynet-fastholder-forbud-i-chromebook-sag</w:t>
-      </w:r>
+        <w:t xml:space="preserve">.</w:t>
+      </w:r>
+      <w:r>
+        <w:t xml:space="preserve"> </w:t>
+      </w:r>
+      <w:hyperlink r:id="rId148">
+        <w:r>
+          <w:rPr>
+            <w:rStyle w:val="Hyperlink"/>
+          </w:rPr>
+          <w:t xml:space="preserve">https://www.datatilsynet.dk/afgoerelser/afgoerelser/2022/aug/datatilsynet-fastholder-forbud-i-chromebook-sag</w:t>
+        </w:r>
+      </w:hyperlink>
     </w:p>
     <w:p>
       <w:pPr>
@@ -7298,8 +7441,19 @@
         <w:t xml:space="preserve">Chromebooks: Datatilsynet suspenderer forbud og giver påbud om lovliggørelse</w:t>
       </w:r>
       <w:r>
-        <w:t xml:space="preserve">. https://www.datatilsynet.dk/presse-og-nyheder/nyhedsarkiv/2022/sep/chromebooks-datatilsynet-suspenderer-forbud-og-giver-paabud-om-lovliggoerelse-</w:t>
-      </w:r>
+        <w:t xml:space="preserve">.</w:t>
+      </w:r>
+      <w:r>
+        <w:t xml:space="preserve"> </w:t>
+      </w:r>
+      <w:hyperlink r:id="rId149">
+        <w:r>
+          <w:rPr>
+            <w:rStyle w:val="Hyperlink"/>
+          </w:rPr>
+          <w:t xml:space="preserve">https://www.datatilsynet.dk/presse-og-nyheder/nyhedsarkiv/2022/sep/chromebooks-datatilsynet-suspenderer-forbud-og-giver-paabud-om-lovliggoerelse-</w:t>
+        </w:r>
+      </w:hyperlink>
     </w:p>
     <w:p>
       <w:pPr>
@@ -7323,8 +7477,19 @@
         <w:t xml:space="preserve">Datatilsynet udsteder påbud til 53 kommuner i den landsdækkende Chromebook-sag</w:t>
       </w:r>
       <w:r>
-        <w:t xml:space="preserve">. https://www.lovguiden.dk/dokument/datatilsynet/30-01-2024-datatilsynet-udsteder-paabud-til-53-kommuner-i-den-landsdaekkende-chromebook-sag</w:t>
-      </w:r>
+        <w:t xml:space="preserve">.</w:t>
+      </w:r>
+      <w:r>
+        <w:t xml:space="preserve"> </w:t>
+      </w:r>
+      <w:hyperlink r:id="rId150">
+        <w:r>
+          <w:rPr>
+            <w:rStyle w:val="Hyperlink"/>
+          </w:rPr>
+          <w:t xml:space="preserve">https://www.lovguiden.dk/dokument/datatilsynet/30-01-2024-datatilsynet-udsteder-paabud-til-53-kommuner-i-den-landsdaekkende-chromebook-sag</w:t>
+        </w:r>
+      </w:hyperlink>
     </w:p>
     <w:p>
       <w:pPr>
@@ -7348,8 +7513,19 @@
         <w:t xml:space="preserve">Chromebook-sagen: Kommunerne efterlever Datatilsynets seneste påbud</w:t>
       </w:r>
       <w:r>
-        <w:t xml:space="preserve">. https://www.datatilsynet.dk/presse-og-nyheder/nyhedsarkiv/2024/jul/chromebook-sagen-kommunerne-efterlever-datatilsynets-seneste-paabud-</w:t>
-      </w:r>
+        <w:t xml:space="preserve">.</w:t>
+      </w:r>
+      <w:r>
+        <w:t xml:space="preserve"> </w:t>
+      </w:r>
+      <w:hyperlink r:id="rId151">
+        <w:r>
+          <w:rPr>
+            <w:rStyle w:val="Hyperlink"/>
+          </w:rPr>
+          <w:t xml:space="preserve">https://www.datatilsynet.dk/presse-og-nyheder/nyhedsarkiv/2024/jul/chromebook-sagen-kommunerne-efterlever-datatilsynets-seneste-paabud-</w:t>
+        </w:r>
+      </w:hyperlink>
     </w:p>
     <w:p>
       <w:pPr>
@@ -7373,8 +7549,19 @@
         <w:t xml:space="preserve">Diario Oficial de la Unión Europea</w:t>
       </w:r>
       <w:r>
-        <w:t xml:space="preserve">, L 231. http://data.europa.eu/eli/dec_impl/2023/1795/oj</w:t>
-      </w:r>
+        <w:t xml:space="preserve">, L 231.</w:t>
+      </w:r>
+      <w:r>
+        <w:t xml:space="preserve"> </w:t>
+      </w:r>
+      <w:hyperlink r:id="rId152">
+        <w:r>
+          <w:rPr>
+            <w:rStyle w:val="Hyperlink"/>
+          </w:rPr>
+          <w:t xml:space="preserve">http://data.europa.eu/eli/dec_impl/2023/1795/oj</w:t>
+        </w:r>
+      </w:hyperlink>
     </w:p>
     <w:p>
       <w:pPr>
@@ -7457,8 +7644,19 @@
         <w:t xml:space="preserve"> </w:t>
       </w:r>
       <w:r>
-        <w:t xml:space="preserve">[Nota de prensa]. https://www.gov.uk/government/news/gcse-and-a-level-students-to-receive-centre-assessment-grades</w:t>
-      </w:r>
+        <w:t xml:space="preserve">[Nota de prensa].</w:t>
+      </w:r>
+      <w:r>
+        <w:t xml:space="preserve"> </w:t>
+      </w:r>
+      <w:hyperlink r:id="rId153">
+        <w:r>
+          <w:rPr>
+            <w:rStyle w:val="Hyperlink"/>
+          </w:rPr>
+          <w:t xml:space="preserve">https://www.gov.uk/government/news/gcse-and-a-level-students-to-receive-centre-assessment-grades</w:t>
+        </w:r>
+      </w:hyperlink>
     </w:p>
     <w:p>
       <w:pPr>
@@ -7538,8 +7736,19 @@
         <w:t xml:space="preserve">Proyecto que ajusta la instalación de los SLEP pasa a la Sala</w:t>
       </w:r>
       <w:r>
-        <w:t xml:space="preserve">. https://www.diarioestrategia.cl/texto-diario/mostrar/6038115/proyecto-ajusta-instalacion-slep-pasa-sala</w:t>
-      </w:r>
+        <w:t xml:space="preserve">.</w:t>
+      </w:r>
+      <w:r>
+        <w:t xml:space="preserve"> </w:t>
+      </w:r>
+      <w:hyperlink r:id="rId154">
+        <w:r>
+          <w:rPr>
+            <w:rStyle w:val="Hyperlink"/>
+          </w:rPr>
+          <w:t xml:space="preserve">https://www.diarioestrategia.cl/texto-diario/mostrar/6038115/proyecto-ajusta-instalacion-slep-pasa-sala</w:t>
+        </w:r>
+      </w:hyperlink>
     </w:p>
     <w:p>
       <w:pPr>
@@ -7619,8 +7828,19 @@
         <w:t xml:space="preserve">Estudio del CIAE vincula Ley de Inclusión y SAE con histórica baja de segregación escolar</w:t>
       </w:r>
       <w:r>
-        <w:t xml:space="preserve">. https://www.elmostrador.cl/noticias/pais/2026/07/15/estudio-del-ciae-vincula-ley-de-inclusion-y-sae-con-historica-baja-de-segregacion-escolar/</w:t>
-      </w:r>
+        <w:t xml:space="preserve">.</w:t>
+      </w:r>
+      <w:r>
+        <w:t xml:space="preserve"> </w:t>
+      </w:r>
+      <w:hyperlink r:id="rId155">
+        <w:r>
+          <w:rPr>
+            <w:rStyle w:val="Hyperlink"/>
+          </w:rPr>
+          <w:t xml:space="preserve">https://www.elmostrador.cl/noticias/pais/2026/07/15/estudio-del-ciae-vincula-ley-de-inclusion-y-sae-con-historica-baja-de-segregacion-escolar/</w:t>
+        </w:r>
+      </w:hyperlink>
     </w:p>
     <w:p>
       <w:pPr>
@@ -7644,8 +7864,19 @@
         <w:t xml:space="preserve">e-Literate</w:t>
       </w:r>
       <w:r>
-        <w:t xml:space="preserve">. https://eliterate.us/course-signals-effectiveness-data-appears-meaningless-care/</w:t>
-      </w:r>
+        <w:t xml:space="preserve">.</w:t>
+      </w:r>
+      <w:r>
+        <w:t xml:space="preserve"> </w:t>
+      </w:r>
+      <w:hyperlink r:id="rId156">
+        <w:r>
+          <w:rPr>
+            <w:rStyle w:val="Hyperlink"/>
+          </w:rPr>
+          <w:t xml:space="preserve">https://eliterate.us/course-signals-effectiveness-data-appears-meaningless-care/</w:t>
+        </w:r>
+      </w:hyperlink>
     </w:p>
     <w:p>
       <w:pPr>
@@ -7694,7 +7925,24 @@
         <w:t xml:space="preserve">Daimon. Revista de Filosofía</w:t>
       </w:r>
       <w:r>
-        <w:t xml:space="preserve">, (11), 5-26. https://revistas.um.es/daimon/article/view/7261 (Obra original publicada en 1990)</w:t>
+        <w:t xml:space="preserve">, (11), 5-26.</w:t>
+      </w:r>
+      <w:r>
+        <w:t xml:space="preserve"> </w:t>
+      </w:r>
+      <w:hyperlink r:id="rId157">
+        <w:r>
+          <w:rPr>
+            <w:rStyle w:val="Hyperlink"/>
+          </w:rPr>
+          <w:t xml:space="preserve">https://revistas.um.es/daimon/article/view/7261</w:t>
+        </w:r>
+      </w:hyperlink>
+      <w:r>
+        <w:t xml:space="preserve"> </w:t>
+      </w:r>
+      <w:r>
+        <w:t xml:space="preserve">(Obra original publicada en 1990)</w:t>
       </w:r>
     </w:p>
     <w:p>
@@ -7975,8 +8223,19 @@
         <w:t xml:space="preserve">GPS Advising</w:t>
       </w:r>
       <w:r>
-        <w:t xml:space="preserve">. https://success.gsu.edu/gps-advising/</w:t>
-      </w:r>
+        <w:t xml:space="preserve">.</w:t>
+      </w:r>
+      <w:r>
+        <w:t xml:space="preserve"> </w:t>
+      </w:r>
+      <w:hyperlink r:id="rId158">
+        <w:r>
+          <w:rPr>
+            <w:rStyle w:val="Hyperlink"/>
+          </w:rPr>
+          <w:t xml:space="preserve">https://success.gsu.edu/gps-advising/</w:t>
+        </w:r>
+      </w:hyperlink>
     </w:p>
     <w:p>
       <w:pPr>
@@ -8000,8 +8259,19 @@
         <w:t xml:space="preserve">Georgia State national leader in driving student success through data</w:t>
       </w:r>
       <w:r>
-        <w:t xml:space="preserve">. https://news.gsu.edu/2017/03/16/georgia-state-student-success-data/</w:t>
-      </w:r>
+        <w:t xml:space="preserve">.</w:t>
+      </w:r>
+      <w:r>
+        <w:t xml:space="preserve"> </w:t>
+      </w:r>
+      <w:hyperlink r:id="rId159">
+        <w:r>
+          <w:rPr>
+            <w:rStyle w:val="Hyperlink"/>
+          </w:rPr>
+          <w:t xml:space="preserve">https://news.gsu.edu/2017/03/16/georgia-state-student-success-data/</w:t>
+        </w:r>
+      </w:hyperlink>
     </w:p>
     <w:p>
       <w:pPr>
@@ -8025,8 +8295,19 @@
         <w:t xml:space="preserve">To ban or not to ban? Monitoring countries’ regulations on smartphone use in school</w:t>
       </w:r>
       <w:r>
-        <w:t xml:space="preserve">. World Education Blog. https://world-education-blog.org/2025/01/23/to-ban-or-not-to-ban-monitoring-countries-regulations-on-smartphone-use-in-school/</w:t>
-      </w:r>
+        <w:t xml:space="preserve">. World Education Blog.</w:t>
+      </w:r>
+      <w:r>
+        <w:t xml:space="preserve"> </w:t>
+      </w:r>
+      <w:hyperlink r:id="rId160">
+        <w:r>
+          <w:rPr>
+            <w:rStyle w:val="Hyperlink"/>
+          </w:rPr>
+          <w:t xml:space="preserve">https://world-education-blog.org/2025/01/23/to-ban-or-not-to-ban-monitoring-countries-regulations-on-smartphone-use-in-school/</w:t>
+        </w:r>
+      </w:hyperlink>
     </w:p>
     <w:p>
       <w:pPr>
@@ -8050,8 +8331,19 @@
         <w:t xml:space="preserve">Google Workspace for Education terms of service</w:t>
       </w:r>
       <w:r>
-        <w:t xml:space="preserve">. https://workspace.google.com/terms/education_terms.html</w:t>
-      </w:r>
+        <w:t xml:space="preserve">.</w:t>
+      </w:r>
+      <w:r>
+        <w:t xml:space="preserve"> </w:t>
+      </w:r>
+      <w:hyperlink r:id="rId161">
+        <w:r>
+          <w:rPr>
+            <w:rStyle w:val="Hyperlink"/>
+          </w:rPr>
+          <w:t xml:space="preserve">https://workspace.google.com/terms/education_terms.html</w:t>
+        </w:r>
+      </w:hyperlink>
     </w:p>
     <w:p>
       <w:pPr>
@@ -8075,8 +8367,19 @@
         <w:t xml:space="preserve">Google Workspace for Education privacy notice</w:t>
       </w:r>
       <w:r>
-        <w:t xml:space="preserve">. https://workspace.google.com/terms/education_privacy.html</w:t>
-      </w:r>
+        <w:t xml:space="preserve">.</w:t>
+      </w:r>
+      <w:r>
+        <w:t xml:space="preserve"> </w:t>
+      </w:r>
+      <w:hyperlink r:id="rId162">
+        <w:r>
+          <w:rPr>
+            <w:rStyle w:val="Hyperlink"/>
+          </w:rPr>
+          <w:t xml:space="preserve">https://workspace.google.com/terms/education_privacy.html</w:t>
+        </w:r>
+      </w:hyperlink>
     </w:p>
     <w:p>
       <w:pPr>
@@ -8352,8 +8655,19 @@
         <w:t xml:space="preserve">Building a pathway to student success at Georgia State University</w:t>
       </w:r>
       <w:r>
-        <w:t xml:space="preserve">. Ithaka S+R. https://doi.org/10.18665/sr.221053</w:t>
-      </w:r>
+        <w:t xml:space="preserve">. Ithaka S+R.</w:t>
+      </w:r>
+      <w:r>
+        <w:t xml:space="preserve"> </w:t>
+      </w:r>
+      <w:hyperlink r:id="rId163">
+        <w:r>
+          <w:rPr>
+            <w:rStyle w:val="Hyperlink"/>
+          </w:rPr>
+          <w:t xml:space="preserve">https://doi.org/10.18665/sr.221053</w:t>
+        </w:r>
+      </w:hyperlink>
     </w:p>
     <w:p>
       <w:pPr>
@@ -8405,8 +8719,19 @@
         <w:t xml:space="preserve">Diario Oficial de la República de Chile</w:t>
       </w:r>
       <w:r>
-        <w:t xml:space="preserve">. https://www.bcn.cl/leychile/navegar?idLey=20370</w:t>
-      </w:r>
+        <w:t xml:space="preserve">.</w:t>
+      </w:r>
+      <w:r>
+        <w:t xml:space="preserve"> </w:t>
+      </w:r>
+      <w:hyperlink r:id="rId164">
+        <w:r>
+          <w:rPr>
+            <w:rStyle w:val="Hyperlink"/>
+          </w:rPr>
+          <w:t xml:space="preserve">https://www.bcn.cl/leychile/navegar?idLey=20370</w:t>
+        </w:r>
+      </w:hyperlink>
     </w:p>
     <w:p>
       <w:pPr>
@@ -8430,8 +8755,19 @@
         <w:t xml:space="preserve">Diario Oficial de la República de Chile</w:t>
       </w:r>
       <w:r>
-        <w:t xml:space="preserve">. https://www.bcn.cl/leychile/navegar?idLey=20845</w:t>
-      </w:r>
+        <w:t xml:space="preserve">.</w:t>
+      </w:r>
+      <w:r>
+        <w:t xml:space="preserve"> </w:t>
+      </w:r>
+      <w:hyperlink r:id="rId165">
+        <w:r>
+          <w:rPr>
+            <w:rStyle w:val="Hyperlink"/>
+          </w:rPr>
+          <w:t xml:space="preserve">https://www.bcn.cl/leychile/navegar?idLey=20845</w:t>
+        </w:r>
+      </w:hyperlink>
     </w:p>
     <w:p>
       <w:pPr>
@@ -8455,8 +8791,19 @@
         <w:t xml:space="preserve">Diario Oficial de la República de Chile</w:t>
       </w:r>
       <w:r>
-        <w:t xml:space="preserve">. https://www.bcn.cl/leychile/navegar?idLey=20903</w:t>
-      </w:r>
+        <w:t xml:space="preserve">.</w:t>
+      </w:r>
+      <w:r>
+        <w:t xml:space="preserve"> </w:t>
+      </w:r>
+      <w:hyperlink r:id="rId166">
+        <w:r>
+          <w:rPr>
+            <w:rStyle w:val="Hyperlink"/>
+          </w:rPr>
+          <w:t xml:space="preserve">https://www.bcn.cl/leychile/navegar?idLey=20903</w:t>
+        </w:r>
+      </w:hyperlink>
     </w:p>
     <w:p>
       <w:pPr>
@@ -8480,8 +8827,19 @@
         <w:t xml:space="preserve">Diario Oficial de la República de Chile</w:t>
       </w:r>
       <w:r>
-        <w:t xml:space="preserve">. https://www.bcn.cl/leychile/navegar?idLey=21040</w:t>
-      </w:r>
+        <w:t xml:space="preserve">.</w:t>
+      </w:r>
+      <w:r>
+        <w:t xml:space="preserve"> </w:t>
+      </w:r>
+      <w:hyperlink r:id="rId167">
+        <w:r>
+          <w:rPr>
+            <w:rStyle w:val="Hyperlink"/>
+          </w:rPr>
+          <w:t xml:space="preserve">https://www.bcn.cl/leychile/navegar?idLey=21040</w:t>
+        </w:r>
+      </w:hyperlink>
     </w:p>
     <w:p>
       <w:pPr>
@@ -8505,8 +8863,19 @@
         <w:t xml:space="preserve">Diario Oficial de la República de Chile</w:t>
       </w:r>
       <w:r>
-        <w:t xml:space="preserve">. https://www.bcn.cl/leychile/navegar?idLey=21728</w:t>
-      </w:r>
+        <w:t xml:space="preserve">.</w:t>
+      </w:r>
+      <w:r>
+        <w:t xml:space="preserve"> </w:t>
+      </w:r>
+      <w:hyperlink r:id="rId168">
+        <w:r>
+          <w:rPr>
+            <w:rStyle w:val="Hyperlink"/>
+          </w:rPr>
+          <w:t xml:space="preserve">https://www.bcn.cl/leychile/navegar?idLey=21728</w:t>
+        </w:r>
+      </w:hyperlink>
     </w:p>
     <w:p>
       <w:pPr>
@@ -8543,8 +8912,19 @@
         <w:t xml:space="preserve">4</w:t>
       </w:r>
       <w:r>
-        <w:t xml:space="preserve">(7), Artículo 100779. https://doi.org/10.1016/j.patter.2023.100779</w:t>
-      </w:r>
+        <w:t xml:space="preserve">(7), Artículo 100779.</w:t>
+      </w:r>
+      <w:r>
+        <w:t xml:space="preserve"> </w:t>
+      </w:r>
+      <w:hyperlink r:id="rId169">
+        <w:r>
+          <w:rPr>
+            <w:rStyle w:val="Hyperlink"/>
+          </w:rPr>
+          <w:t xml:space="preserve">https://doi.org/10.1016/j.patter.2023.100779</w:t>
+        </w:r>
+      </w:hyperlink>
     </w:p>
     <w:p>
       <w:pPr>
@@ -8596,8 +8976,19 @@
         <w:t xml:space="preserve">¿Cómo será el proceso de pago?: Presidente Boric promulga ley que da solución a deuda histórica docente</w:t>
       </w:r>
       <w:r>
-        <w:t xml:space="preserve">. https://www.meganoticias.cl/nacional/474482-deuda-historica-ley-presidente-boric-proceso-de-pago-brk-31-01-2025.html</w:t>
-      </w:r>
+        <w:t xml:space="preserve">.</w:t>
+      </w:r>
+      <w:r>
+        <w:t xml:space="preserve"> </w:t>
+      </w:r>
+      <w:hyperlink r:id="rId170">
+        <w:r>
+          <w:rPr>
+            <w:rStyle w:val="Hyperlink"/>
+          </w:rPr>
+          <w:t xml:space="preserve">https://www.meganoticias.cl/nacional/474482-deuda-historica-ley-presidente-boric-proceso-de-pago-brk-31-01-2025.html</w:t>
+        </w:r>
+      </w:hyperlink>
     </w:p>
     <w:p>
       <w:pPr>
@@ -8621,8 +9012,19 @@
         <w:t xml:space="preserve">Guidance for generative AI in education and research</w:t>
       </w:r>
       <w:r>
-        <w:t xml:space="preserve">. UNESCO. https://doi.org/10.54675/EWZM9535</w:t>
-      </w:r>
+        <w:t xml:space="preserve">. UNESCO.</w:t>
+      </w:r>
+      <w:r>
+        <w:t xml:space="preserve"> </w:t>
+      </w:r>
+      <w:hyperlink r:id="rId171">
+        <w:r>
+          <w:rPr>
+            <w:rStyle w:val="Hyperlink"/>
+          </w:rPr>
+          <w:t xml:space="preserve">https://doi.org/10.54675/EWZM9535</w:t>
+        </w:r>
+      </w:hyperlink>
     </w:p>
     <w:p>
       <w:pPr>
@@ -8646,8 +9048,19 @@
         <w:t xml:space="preserve">Journal officiel de la République française</w:t>
       </w:r>
       <w:r>
-        <w:t xml:space="preserve">, Assemblée nationale. https://questions.assemblee-nationale.fr/q16/16-971QE.htm</w:t>
-      </w:r>
+        <w:t xml:space="preserve">, Assemblée nationale.</w:t>
+      </w:r>
+      <w:r>
+        <w:t xml:space="preserve"> </w:t>
+      </w:r>
+      <w:hyperlink r:id="rId172">
+        <w:r>
+          <w:rPr>
+            <w:rStyle w:val="Hyperlink"/>
+          </w:rPr>
+          <w:t xml:space="preserve">https://questions.assemblee-nationale.fr/q16/16-971QE.htm</w:t>
+        </w:r>
+      </w:hyperlink>
     </w:p>
     <w:p>
       <w:pPr>
@@ -8671,8 +9084,19 @@
         <w:t xml:space="preserve">Más del 50 % del nuevo Sistema de Educación Pública instalado: 10 SLEP inician su administración educacional</w:t>
       </w:r>
       <w:r>
-        <w:t xml:space="preserve">. https://www.mineduc.cl/mas-del-50-del-nuevo-sistema-de-educacion-publica-instalado-10-slep-inician-su-administracion-educacional/</w:t>
-      </w:r>
+        <w:t xml:space="preserve">.</w:t>
+      </w:r>
+      <w:r>
+        <w:t xml:space="preserve"> </w:t>
+      </w:r>
+      <w:hyperlink r:id="rId173">
+        <w:r>
+          <w:rPr>
+            <w:rStyle w:val="Hyperlink"/>
+          </w:rPr>
+          <w:t xml:space="preserve">https://www.mineduc.cl/mas-del-50-del-nuevo-sistema-de-educacion-publica-instalado-10-slep-inician-su-administracion-educacional/</w:t>
+        </w:r>
+      </w:hyperlink>
     </w:p>
     <w:p>
       <w:pPr>
@@ -8724,8 +9148,19 @@
         <w:t xml:space="preserve">How one university used big data to boost graduation rates</w:t>
       </w:r>
       <w:r>
-        <w:t xml:space="preserve">. https://www.npr.org/sections/ed/2016/10/30/499200614/how-one-university-used-big-data-to-boost-graduation-rates</w:t>
-      </w:r>
+        <w:t xml:space="preserve">.</w:t>
+      </w:r>
+      <w:r>
+        <w:t xml:space="preserve"> </w:t>
+      </w:r>
+      <w:hyperlink r:id="rId174">
+        <w:r>
+          <w:rPr>
+            <w:rStyle w:val="Hyperlink"/>
+          </w:rPr>
+          <w:t xml:space="preserve">https://www.npr.org/sections/ed/2016/10/30/499200614/how-one-university-used-big-data-to-boost-graduation-rates</w:t>
+        </w:r>
+      </w:hyperlink>
     </w:p>
     <w:p>
       <w:pPr>
@@ -8749,8 +9184,19 @@
         <w:t xml:space="preserve">Students, computers and learning: Making the connection</w:t>
       </w:r>
       <w:r>
-        <w:t xml:space="preserve">. OECD Publishing. https://doi.org/10.1787/9789264239555-en</w:t>
-      </w:r>
+        <w:t xml:space="preserve">. OECD Publishing.</w:t>
+      </w:r>
+      <w:r>
+        <w:t xml:space="preserve"> </w:t>
+      </w:r>
+      <w:hyperlink r:id="rId175">
+        <w:r>
+          <w:rPr>
+            <w:rStyle w:val="Hyperlink"/>
+          </w:rPr>
+          <w:t xml:space="preserve">https://doi.org/10.1787/9789264239555-en</w:t>
+        </w:r>
+      </w:hyperlink>
     </w:p>
     <w:p>
       <w:pPr>
@@ -8774,8 +9220,19 @@
         <w:t xml:space="preserve">PISA 2022 results (Volume II): Learning during – and from – disruption</w:t>
       </w:r>
       <w:r>
-        <w:t xml:space="preserve">. OECD Publishing. https://doi.org/10.1787/a97db61c-en</w:t>
-      </w:r>
+        <w:t xml:space="preserve">. OECD Publishing.</w:t>
+      </w:r>
+      <w:r>
+        <w:t xml:space="preserve"> </w:t>
+      </w:r>
+      <w:hyperlink r:id="rId176">
+        <w:r>
+          <w:rPr>
+            <w:rStyle w:val="Hyperlink"/>
+          </w:rPr>
+          <w:t xml:space="preserve">https://doi.org/10.1787/a97db61c-en</w:t>
+        </w:r>
+      </w:hyperlink>
     </w:p>
     <w:p>
       <w:pPr>
@@ -8802,8 +9259,19 @@
         <w:t xml:space="preserve"> </w:t>
       </w:r>
       <w:r>
-        <w:t xml:space="preserve">[Comunicado de prensa]. https://www.oecd.org/en/about/news/press-releases/2023/12/decline-in-educational-performance-only-partly-attributable-to-the-covid-19-pandemic.html</w:t>
-      </w:r>
+        <w:t xml:space="preserve">[Comunicado de prensa].</w:t>
+      </w:r>
+      <w:r>
+        <w:t xml:space="preserve"> </w:t>
+      </w:r>
+      <w:hyperlink r:id="rId177">
+        <w:r>
+          <w:rPr>
+            <w:rStyle w:val="Hyperlink"/>
+          </w:rPr>
+          <w:t xml:space="preserve">https://www.oecd.org/en/about/news/press-releases/2023/12/decline-in-educational-performance-only-partly-attributable-to-the-covid-19-pandemic.html</w:t>
+        </w:r>
+      </w:hyperlink>
     </w:p>
     <w:p>
       <w:pPr>
@@ -8827,8 +9295,19 @@
         <w:t xml:space="preserve">Students, digital devices and success</w:t>
       </w:r>
       <w:r>
-        <w:t xml:space="preserve">. OECD Publishing. https://www.oecd.org/content/dam/oecd/en/publications/reports/2024/05/students-digital-devices-and-success_621829ff/9e4c0624-en.pdf</w:t>
-      </w:r>
+        <w:t xml:space="preserve">. OECD Publishing.</w:t>
+      </w:r>
+      <w:r>
+        <w:t xml:space="preserve"> </w:t>
+      </w:r>
+      <w:hyperlink r:id="rId178">
+        <w:r>
+          <w:rPr>
+            <w:rStyle w:val="Hyperlink"/>
+          </w:rPr>
+          <w:t xml:space="preserve">https://www.oecd.org/content/dam/oecd/en/publications/reports/2024/05/students-digital-devices-and-success_621829ff/9e4c0624-en.pdf</w:t>
+        </w:r>
+      </w:hyperlink>
     </w:p>
     <w:p>
       <w:pPr>
@@ -8855,8 +9334,19 @@
         <w:t xml:space="preserve"> </w:t>
       </w:r>
       <w:r>
-        <w:t xml:space="preserve">(Ofqual/20/6656/1). https://www.gov.uk/government/publications/awarding-gcse-as-a-levels-in-summer-2020-interim-report</w:t>
-      </w:r>
+        <w:t xml:space="preserve">(Ofqual/20/6656/1).</w:t>
+      </w:r>
+      <w:r>
+        <w:t xml:space="preserve"> </w:t>
+      </w:r>
+      <w:hyperlink r:id="rId179">
+        <w:r>
+          <w:rPr>
+            <w:rStyle w:val="Hyperlink"/>
+          </w:rPr>
+          <w:t xml:space="preserve">https://www.gov.uk/government/publications/awarding-gcse-as-a-levels-in-summer-2020-interim-report</w:t>
+        </w:r>
+      </w:hyperlink>
     </w:p>
     <w:p>
       <w:pPr>
@@ -9048,8 +9538,19 @@
         <w:t xml:space="preserve">Purdue Today</w:t>
       </w:r>
       <w:r>
-        <w:t xml:space="preserve">. https://www.purdue.edu/uns/PurdueToday/archive/2013/09-September/130925PurdueToday.htm</w:t>
-      </w:r>
+        <w:t xml:space="preserve">.</w:t>
+      </w:r>
+      <w:r>
+        <w:t xml:space="preserve"> </w:t>
+      </w:r>
+      <w:hyperlink r:id="rId180">
+        <w:r>
+          <w:rPr>
+            <w:rStyle w:val="Hyperlink"/>
+          </w:rPr>
+          <w:t xml:space="preserve">https://www.purdue.edu/uns/PurdueToday/archive/2013/09-September/130925PurdueToday.htm</w:t>
+        </w:r>
+      </w:hyperlink>
     </w:p>
     <w:p>
       <w:pPr>
@@ -9073,8 +9574,19 @@
         <w:t xml:space="preserve">Diario Oficial de la Unión Europea</w:t>
       </w:r>
       <w:r>
-        <w:t xml:space="preserve">, L 119, 1-88. http://data.europa.eu/eli/reg/2016/679/oj</w:t>
-      </w:r>
+        <w:t xml:space="preserve">, L 119, 1-88.</w:t>
+      </w:r>
+      <w:r>
+        <w:t xml:space="preserve"> </w:t>
+      </w:r>
+      <w:hyperlink r:id="rId181">
+        <w:r>
+          <w:rPr>
+            <w:rStyle w:val="Hyperlink"/>
+          </w:rPr>
+          <w:t xml:space="preserve">http://data.europa.eu/eli/reg/2016/679/oj</w:t>
+        </w:r>
+      </w:hyperlink>
     </w:p>
     <w:p>
       <w:pPr>
@@ -9098,8 +9610,19 @@
         <w:t xml:space="preserve">Diario Oficial de la Unión Europea</w:t>
       </w:r>
       <w:r>
-        <w:t xml:space="preserve">, L, 2024/1689. http://data.europa.eu/eli/reg/2024/1689/oj</w:t>
-      </w:r>
+        <w:t xml:space="preserve">, L, 2024/1689.</w:t>
+      </w:r>
+      <w:r>
+        <w:t xml:space="preserve"> </w:t>
+      </w:r>
+      <w:hyperlink r:id="rId182">
+        <w:r>
+          <w:rPr>
+            <w:rStyle w:val="Hyperlink"/>
+          </w:rPr>
+          <w:t xml:space="preserve">http://data.europa.eu/eli/reg/2024/1689/oj</w:t>
+        </w:r>
+      </w:hyperlink>
     </w:p>
     <w:p>
       <w:pPr>
@@ -9123,8 +9646,19 @@
         <w:t xml:space="preserve">Diario Oficial de la Unión Europea</w:t>
       </w:r>
       <w:r>
-        <w:t xml:space="preserve">, L, 2026/1744, de 24 de julio de 2026. http://data.europa.eu/eli/reg/2026/1744/oj</w:t>
-      </w:r>
+        <w:t xml:space="preserve">, L, 2026/1744, de 24 de julio de 2026.</w:t>
+      </w:r>
+      <w:r>
+        <w:t xml:space="preserve"> </w:t>
+      </w:r>
+      <w:hyperlink r:id="rId183">
+        <w:r>
+          <w:rPr>
+            <w:rStyle w:val="Hyperlink"/>
+          </w:rPr>
+          <w:t xml:space="preserve">http://data.europa.eu/eli/reg/2026/1744/oj</w:t>
+        </w:r>
+      </w:hyperlink>
     </w:p>
     <w:p>
       <w:pPr>
@@ -9148,8 +9682,19 @@
         <w:t xml:space="preserve">Plataformas digitales BigTech del sistema educativo catalán y derechos de la infancia: Amenazas y retos. Informe final del proyecto edDIT</w:t>
       </w:r>
       <w:r>
-        <w:t xml:space="preserve">. aFFaC y Esbrina, Universitat de Barcelona. http://diposit.ub.edu/dspace/handle/2445/192941</w:t>
-      </w:r>
+        <w:t xml:space="preserve">. aFFaC y Esbrina, Universitat de Barcelona.</w:t>
+      </w:r>
+      <w:r>
+        <w:t xml:space="preserve"> </w:t>
+      </w:r>
+      <w:hyperlink r:id="rId184">
+        <w:r>
+          <w:rPr>
+            <w:rStyle w:val="Hyperlink"/>
+          </w:rPr>
+          <w:t xml:space="preserve">http://diposit.ub.edu/dspace/handle/2445/192941</w:t>
+        </w:r>
+      </w:hyperlink>
     </w:p>
     <w:p>
       <w:pPr>
@@ -9173,8 +9718,19 @@
         <w:t xml:space="preserve">MAAPS advising experiment: Evaluation findings after four years</w:t>
       </w:r>
       <w:r>
-        <w:t xml:space="preserve">. Ithaka S+R. https://sr.ithaka.org/wp-content/uploads/2021/06/SR_Report-MAAPS-Evaluation-Findings-After-Four-Years-062421.pdf</w:t>
-      </w:r>
+        <w:t xml:space="preserve">. Ithaka S+R.</w:t>
+      </w:r>
+      <w:r>
+        <w:t xml:space="preserve"> </w:t>
+      </w:r>
+      <w:hyperlink r:id="rId185">
+        <w:r>
+          <w:rPr>
+            <w:rStyle w:val="Hyperlink"/>
+          </w:rPr>
+          <w:t xml:space="preserve">https://sr.ithaka.org/wp-content/uploads/2021/06/SR_Report-MAAPS-Evaluation-Findings-After-Four-Years-062421.pdf</w:t>
+        </w:r>
+      </w:hyperlink>
     </w:p>
     <w:p>
       <w:pPr>
@@ -9198,8 +9754,19 @@
         <w:t xml:space="preserve">MAAPS advising experiment: Evaluation findings after six years</w:t>
       </w:r>
       <w:r>
-        <w:t xml:space="preserve">. Ithaka S+R. https://sr.ithaka.org/publications/maaps-advising-experiment-evaluation-6-years/</w:t>
-      </w:r>
+        <w:t xml:space="preserve">. Ithaka S+R.</w:t>
+      </w:r>
+      <w:r>
+        <w:t xml:space="preserve"> </w:t>
+      </w:r>
+      <w:hyperlink r:id="rId186">
+        <w:r>
+          <w:rPr>
+            <w:rStyle w:val="Hyperlink"/>
+          </w:rPr>
+          <w:t xml:space="preserve">https://sr.ithaka.org/publications/maaps-advising-experiment-evaluation-6-years/</w:t>
+        </w:r>
+      </w:hyperlink>
     </w:p>
     <w:p>
       <w:pPr>
@@ -9500,8 +10067,19 @@
         <w:t xml:space="preserve">Inside Higher Ed</w:t>
       </w:r>
       <w:r>
-        <w:t xml:space="preserve">. https://www.insidehighered.com/news/2013/11/06/researchers-cast-doubt-about-early-warning-systems-effect-retention</w:t>
-      </w:r>
+        <w:t xml:space="preserve">.</w:t>
+      </w:r>
+      <w:r>
+        <w:t xml:space="preserve"> </w:t>
+      </w:r>
+      <w:hyperlink r:id="rId187">
+        <w:r>
+          <w:rPr>
+            <w:rStyle w:val="Hyperlink"/>
+          </w:rPr>
+          <w:t xml:space="preserve">https://www.insidehighered.com/news/2013/11/06/researchers-cast-doubt-about-early-warning-systems-effect-retention</w:t>
+        </w:r>
+      </w:hyperlink>
     </w:p>
     <w:p>
       <w:pPr>
@@ -9525,8 +10103,19 @@
         <w:t xml:space="preserve">El 66 % de los deudores del CAE se encuentran morosos por más de tres cuotas impagas y en más de la mitad de los casos el Estado tuvo que hacerse cargo de la deuda</w:t>
       </w:r>
       <w:r>
-        <w:t xml:space="preserve">. https://www.theclinic.cl/2025/09/26/el-66-de-los-deudores-del-cae-se-encuentran-morosos-por-mas-de-tres-cuotas-impagas-y-en-mas-de-la-mitad-de-los-casos-el-estado-tuvo-que-hacerse-cargo-de-la-deuda/</w:t>
-      </w:r>
+        <w:t xml:space="preserve">.</w:t>
+      </w:r>
+      <w:r>
+        <w:t xml:space="preserve"> </w:t>
+      </w:r>
+      <w:hyperlink r:id="rId188">
+        <w:r>
+          <w:rPr>
+            <w:rStyle w:val="Hyperlink"/>
+          </w:rPr>
+          <w:t xml:space="preserve">https://www.theclinic.cl/2025/09/26/el-66-de-los-deudores-del-cae-se-encuentran-morosos-por-mas-de-tres-cuotas-impagas-y-en-mas-de-la-mitad-de-los-casos-el-estado-tuvo-que-hacerse-cargo-de-la-deuda/</w:t>
+        </w:r>
+      </w:hyperlink>
     </w:p>
     <w:p>
       <w:pPr>
@@ -9553,8 +10142,19 @@
         <w:t xml:space="preserve"> </w:t>
       </w:r>
       <w:r>
-        <w:t xml:space="preserve">(C-362/14). https://curia.europa.eu/juris/liste.jsf?num=C-362/14</w:t>
-      </w:r>
+        <w:t xml:space="preserve">(C-362/14).</w:t>
+      </w:r>
+      <w:r>
+        <w:t xml:space="preserve"> </w:t>
+      </w:r>
+      <w:hyperlink r:id="rId189">
+        <w:r>
+          <w:rPr>
+            <w:rStyle w:val="Hyperlink"/>
+          </w:rPr>
+          <w:t xml:space="preserve">https://curia.europa.eu/juris/liste.jsf?num=C-362/14</w:t>
+        </w:r>
+      </w:hyperlink>
     </w:p>
     <w:p>
       <w:pPr>
@@ -9581,8 +10181,19 @@
         <w:t xml:space="preserve"> </w:t>
       </w:r>
       <w:r>
-        <w:t xml:space="preserve">(C-311/18). https://curia.europa.eu/juris/liste.jsf?num=C-311/18</w:t>
-      </w:r>
+        <w:t xml:space="preserve">(C-311/18).</w:t>
+      </w:r>
+      <w:r>
+        <w:t xml:space="preserve"> </w:t>
+      </w:r>
+      <w:hyperlink r:id="rId190">
+        <w:r>
+          <w:rPr>
+            <w:rStyle w:val="Hyperlink"/>
+          </w:rPr>
+          <w:t xml:space="preserve">https://curia.europa.eu/juris/liste.jsf?num=C-311/18</w:t>
+        </w:r>
+      </w:hyperlink>
     </w:p>
     <w:p>
       <w:pPr>
@@ -9622,8 +10233,19 @@
         <w:t xml:space="preserve">Diario Oficial de la Unión Europea</w:t>
       </w:r>
       <w:r>
-        <w:t xml:space="preserve">, C, 2025/6610. https://eur-lex.europa.eu/eli/C/2025/6610/oj</w:t>
-      </w:r>
+        <w:t xml:space="preserve">, C, 2025/6610.</w:t>
+      </w:r>
+      <w:r>
+        <w:t xml:space="preserve"> </w:t>
+      </w:r>
+      <w:hyperlink r:id="rId191">
+        <w:r>
+          <w:rPr>
+            <w:rStyle w:val="Hyperlink"/>
+          </w:rPr>
+          <w:t xml:space="preserve">https://eur-lex.europa.eu/eli/C/2025/6610/oj</w:t>
+        </w:r>
+      </w:hyperlink>
     </w:p>
     <w:p>
       <w:pPr>
@@ -9650,8 +10272,19 @@
         <w:t xml:space="preserve"> </w:t>
       </w:r>
       <w:r>
-        <w:t xml:space="preserve">(T-553/23). https://curia.europa.eu/juris/liste.jsf?num=T-553/23</w:t>
-      </w:r>
+        <w:t xml:space="preserve">(T-553/23).</w:t>
+      </w:r>
+      <w:r>
+        <w:t xml:space="preserve"> </w:t>
+      </w:r>
+      <w:hyperlink r:id="rId192">
+        <w:r>
+          <w:rPr>
+            <w:rStyle w:val="Hyperlink"/>
+          </w:rPr>
+          <w:t xml:space="preserve">https://curia.europa.eu/juris/liste.jsf?num=T-553/23</w:t>
+        </w:r>
+      </w:hyperlink>
     </w:p>
     <w:p>
       <w:pPr>
@@ -9677,9 +10310,14 @@
       <w:r>
         <w:t xml:space="preserve"> </w:t>
       </w:r>
-      <w:r>
-        <w:t xml:space="preserve">https://doi.org/10.54676/UZQV8501</w:t>
-      </w:r>
+      <w:hyperlink r:id="rId193">
+        <w:r>
+          <w:rPr>
+            <w:rStyle w:val="Hyperlink"/>
+          </w:rPr>
+          <w:t xml:space="preserve">https://doi.org/10.54676/UZQV8501</w:t>
+        </w:r>
+      </w:hyperlink>
     </w:p>
     <w:p>
       <w:pPr>
@@ -9706,8 +10344,19 @@
         <w:t xml:space="preserve"> </w:t>
       </w:r>
       <w:r>
-        <w:t xml:space="preserve">[Comunicado de prensa]. https://www.unesco.org/en/articles/unesco-governments-must-quickly-regulate-generative-ai-schools</w:t>
-      </w:r>
+        <w:t xml:space="preserve">[Comunicado de prensa].</w:t>
+      </w:r>
+      <w:r>
+        <w:t xml:space="preserve"> </w:t>
+      </w:r>
+      <w:hyperlink r:id="rId194">
+        <w:r>
+          <w:rPr>
+            <w:rStyle w:val="Hyperlink"/>
+          </w:rPr>
+          <w:t xml:space="preserve">https://www.unesco.org/en/articles/unesco-governments-must-quickly-regulate-generative-ai-schools</w:t>
+        </w:r>
+      </w:hyperlink>
     </w:p>
     <w:p>
       <w:pPr>
@@ -9731,8 +10380,19 @@
         <w:t xml:space="preserve">COVID-19: Are children able to continue learning during school closures? A global analysis of the potential reach of remote learning policies using data from 100 countries</w:t>
       </w:r>
       <w:r>
-        <w:t xml:space="preserve">. https://data.unicef.org/resources/remote-learning-reachability-factsheet/</w:t>
-      </w:r>
+        <w:t xml:space="preserve">.</w:t>
+      </w:r>
+      <w:r>
+        <w:t xml:space="preserve"> </w:t>
+      </w:r>
+      <w:hyperlink r:id="rId195">
+        <w:r>
+          <w:rPr>
+            <w:rStyle w:val="Hyperlink"/>
+          </w:rPr>
+          <w:t xml:space="preserve">https://data.unicef.org/resources/remote-learning-reachability-factsheet/</w:t>
+        </w:r>
+      </w:hyperlink>
     </w:p>
     <w:p>
       <w:pPr>
@@ -9759,8 +10419,19 @@
         <w:t xml:space="preserve"> </w:t>
       </w:r>
       <w:r>
-        <w:t xml:space="preserve">[Comunicado de prensa]. https://www.unicef.org/press-releases/covid-19-least-third-worlds-schoolchildren-unable-access-remote-learning-during</w:t>
-      </w:r>
+        <w:t xml:space="preserve">[Comunicado de prensa].</w:t>
+      </w:r>
+      <w:r>
+        <w:t xml:space="preserve"> </w:t>
+      </w:r>
+      <w:hyperlink r:id="rId196">
+        <w:r>
+          <w:rPr>
+            <w:rStyle w:val="Hyperlink"/>
+          </w:rPr>
+          <w:t xml:space="preserve">https://www.unicef.org/press-releases/covid-19-least-third-worlds-schoolchildren-unable-access-remote-learning-during</w:t>
+        </w:r>
+      </w:hyperlink>
     </w:p>
     <w:p>
       <w:pPr>
@@ -9784,8 +10455,19 @@
         <w:t xml:space="preserve">Policy brief: Education during COVID-19 and beyond</w:t>
       </w:r>
       <w:r>
-        <w:t xml:space="preserve">. https://www.un.org/development/desa/dspd/wp-content/uploads/sites/22/2020/08/sg_policy_brief_covid-19_and_education_august_2020.pdf</w:t>
-      </w:r>
+        <w:t xml:space="preserve">.</w:t>
+      </w:r>
+      <w:r>
+        <w:t xml:space="preserve"> </w:t>
+      </w:r>
+      <w:hyperlink r:id="rId197">
+        <w:r>
+          <w:rPr>
+            <w:rStyle w:val="Hyperlink"/>
+          </w:rPr>
+          <w:t xml:space="preserve">https://www.un.org/development/desa/dspd/wp-content/uploads/sites/22/2020/08/sg_policy_brief_covid-19_and_education_august_2020.pdf</w:t>
+        </w:r>
+      </w:hyperlink>
     </w:p>
     <w:p>
       <w:pPr>
@@ -9809,8 +10491,19 @@
         <w:t xml:space="preserve">Expertos debaten baja de la segregación escolar y modificaciones al SAE</w:t>
       </w:r>
       <w:r>
-        <w:t xml:space="preserve">. https://uchile.cl/noticias/242425/expertos-debaten-baja-de-la-segregacion-escolar-y-modificaciones-al-sae</w:t>
-      </w:r>
+        <w:t xml:space="preserve">.</w:t>
+      </w:r>
+      <w:r>
+        <w:t xml:space="preserve"> </w:t>
+      </w:r>
+      <w:hyperlink r:id="rId198">
+        <w:r>
+          <w:rPr>
+            <w:rStyle w:val="Hyperlink"/>
+          </w:rPr>
+          <w:t xml:space="preserve">https://uchile.cl/noticias/242425/expertos-debaten-baja-de-la-segregacion-escolar-y-modificaciones-al-sae</w:t>
+        </w:r>
+      </w:hyperlink>
     </w:p>
     <w:p>
       <w:pPr>
@@ -9875,8 +10568,19 @@
         <w:t xml:space="preserve">29</w:t>
       </w:r>
       <w:r>
-        <w:t xml:space="preserve">(2), 217-241. https://doi.org/10.1080/02680939.2013.806995</w:t>
-      </w:r>
+        <w:t xml:space="preserve">(2), 217-241.</w:t>
+      </w:r>
+      <w:r>
+        <w:t xml:space="preserve"> </w:t>
+      </w:r>
+      <w:hyperlink r:id="rId199">
+        <w:r>
+          <w:rPr>
+            <w:rStyle w:val="Hyperlink"/>
+          </w:rPr>
+          <w:t xml:space="preserve">https://doi.org/10.1080/02680939.2013.806995</w:t>
+        </w:r>
+      </w:hyperlink>
     </w:p>
     <w:p>
       <w:pPr>
@@ -9925,8 +10629,19 @@
         <w:t xml:space="preserve">Prohibició total: Educació elimina els mòbils, les tauletes i els rellotges intel·ligents de les aules de Catalunya</w:t>
       </w:r>
       <w:r>
-        <w:t xml:space="preserve">. https://www.vilaweb.cat/noticies/prohibicio-total-educacio-elimina-mobils-tauletes-rellotges/</w:t>
-      </w:r>
+        <w:t xml:space="preserve">.</w:t>
+      </w:r>
+      <w:r>
+        <w:t xml:space="preserve"> </w:t>
+      </w:r>
+      <w:hyperlink r:id="rId200">
+        <w:r>
+          <w:rPr>
+            <w:rStyle w:val="Hyperlink"/>
+          </w:rPr>
+          <w:t xml:space="preserve">https://www.vilaweb.cat/noticies/prohibicio-total-educacio-elimina-mobils-tauletes-rellotges/</w:t>
+        </w:r>
+      </w:hyperlink>
     </w:p>
     <w:p>
       <w:pPr>
@@ -10025,8 +10740,8 @@
         <w:t xml:space="preserve">Algunas de las ideas de este libro las trabajé antes en una investigación doctoral dirigida por Marina Garcés y Raquel Miño, con la tutoría de Josep Maria Esquirol. Les agradezco la lectura atenta y la libertad.</w:t>
       </w:r>
     </w:p>
-    <w:bookmarkEnd w:id="136"/>
-    <w:bookmarkEnd w:id="137"/>
+    <w:bookmarkEnd w:id="201"/>
+    <w:bookmarkEnd w:id="202"/>
     <w:sectPr>
       <w:footerReference r:id="rId9" w:type="default"/>
       <w:pgSz w:h="16838" w:w="11906"/>

</xml_diff>